<commit_message>
Changes to the User Stories from our meeting on 10/12/2026
</commit_message>
<xml_diff>
--- a/AdditionalDocuments/User Stories.docx
+++ b/AdditionalDocuments/User Stories.docx
@@ -3948,6 +3948,14 @@
                 <w:kern w:val="0"/>
                 <w14:ligatures w14:val="none"/>
               </w:rPr>
+              <w:t xml:space="preserve">(Complete) </w:t>
+            </w:r>
+            <w:r>
+              <w:rPr>
+                <w:rFonts w:ascii="Aptos" w:eastAsia="Times New Roman" w:hAnsi="Aptos" w:cs="Times New Roman"/>
+                <w:kern w:val="0"/>
+                <w14:ligatures w14:val="none"/>
+              </w:rPr>
               <w:t>Medicaid Applicant </w:t>
             </w:r>
           </w:p>
@@ -4073,7 +4081,13 @@
               <w:rPr>
                 <w:rFonts w:ascii="Aptos" w:eastAsia="Times New Roman" w:hAnsi="Aptos" w:cs="Times New Roman"/>
               </w:rPr>
-              <w:t>*Software Developer</w:t>
+              <w:t xml:space="preserve">(Current) (New) </w:t>
+            </w:r>
+            <w:r>
+              <w:rPr>
+                <w:rFonts w:ascii="Aptos" w:eastAsia="Times New Roman" w:hAnsi="Aptos" w:cs="Times New Roman"/>
+              </w:rPr>
+              <w:t>Software Developer</w:t>
             </w:r>
           </w:p>
         </w:tc>
@@ -4177,7 +4191,7 @@
               <w:rPr>
                 <w:rFonts w:ascii="Aptos" w:eastAsia="Times New Roman" w:hAnsi="Aptos" w:cs="Times New Roman"/>
               </w:rPr>
-              <w:t>*</w:t>
+              <w:t xml:space="preserve"> (Current) (New) </w:t>
             </w:r>
             <w:r>
               <w:rPr>
@@ -4249,7 +4263,13 @@
               <w:rPr>
                 <w:rFonts w:ascii="Aptos" w:eastAsia="Times New Roman" w:hAnsi="Aptos" w:cs="Times New Roman"/>
               </w:rPr>
-              <w:t>1 sprint, 1 person, 2 hours</w:t>
+              <w:t>6</w:t>
+            </w:r>
+            <w:r>
+              <w:rPr>
+                <w:rFonts w:ascii="Aptos" w:eastAsia="Times New Roman" w:hAnsi="Aptos" w:cs="Times New Roman"/>
+              </w:rPr>
+              <w:t xml:space="preserve"> sprint, 1 person, 2 hours</w:t>
             </w:r>
           </w:p>
         </w:tc>
@@ -4277,7 +4297,7 @@
               <w:rPr>
                 <w:rFonts w:ascii="Aptos" w:eastAsia="Times New Roman" w:hAnsi="Aptos" w:cs="Times New Roman"/>
               </w:rPr>
-              <w:t>*</w:t>
+              <w:t xml:space="preserve">(New) </w:t>
             </w:r>
             <w:r>
               <w:rPr>
@@ -4390,7 +4410,31 @@
               <w:rPr>
                 <w:rFonts w:ascii="Aptos" w:eastAsia="Times New Roman" w:hAnsi="Aptos" w:cs="Times New Roman"/>
               </w:rPr>
-              <w:t>*Database Developer</w:t>
+              <w:t>(</w:t>
+            </w:r>
+            <w:r>
+              <w:rPr>
+                <w:rFonts w:ascii="Aptos" w:eastAsia="Times New Roman" w:hAnsi="Aptos" w:cs="Times New Roman"/>
+              </w:rPr>
+              <w:t>C</w:t>
+            </w:r>
+            <w:r>
+              <w:rPr>
+                <w:rFonts w:ascii="Aptos" w:eastAsia="Times New Roman" w:hAnsi="Aptos" w:cs="Times New Roman"/>
+              </w:rPr>
+              <w:t xml:space="preserve">urrent) </w:t>
+            </w:r>
+            <w:r>
+              <w:rPr>
+                <w:rFonts w:ascii="Aptos" w:eastAsia="Times New Roman" w:hAnsi="Aptos" w:cs="Times New Roman"/>
+              </w:rPr>
+              <w:t xml:space="preserve">(New) </w:t>
+            </w:r>
+            <w:r>
+              <w:rPr>
+                <w:rFonts w:ascii="Aptos" w:eastAsia="Times New Roman" w:hAnsi="Aptos" w:cs="Times New Roman"/>
+              </w:rPr>
+              <w:t>Database Developer</w:t>
             </w:r>
           </w:p>
         </w:tc>
@@ -4412,7 +4456,19 @@
               <w:rPr>
                 <w:rFonts w:ascii="Aptos" w:eastAsia="Times New Roman" w:hAnsi="Aptos" w:cs="Times New Roman"/>
               </w:rPr>
-              <w:t>As a database developer on the MEVA project, I want to connect the database layer to the API layer so that captured data is safely stored for later reference.</w:t>
+              <w:t xml:space="preserve">As a database developer on the MEVA project, I want to connect the database layer to the API </w:t>
+            </w:r>
+            <w:r>
+              <w:rPr>
+                <w:rFonts w:ascii="Aptos" w:eastAsia="Times New Roman" w:hAnsi="Aptos" w:cs="Times New Roman"/>
+              </w:rPr>
+              <w:t>layer,</w:t>
+            </w:r>
+            <w:r>
+              <w:rPr>
+                <w:rFonts w:ascii="Aptos" w:eastAsia="Times New Roman" w:hAnsi="Aptos" w:cs="Times New Roman"/>
+              </w:rPr>
+              <w:t xml:space="preserve"> so that captured data is safely stored for later reference.</w:t>
             </w:r>
           </w:p>
         </w:tc>
@@ -4485,7 +4541,13 @@
                 <w:rFonts w:ascii="Aptos" w:eastAsia="Times New Roman" w:hAnsi="Aptos" w:cs="Times New Roman"/>
               </w:rPr>
               <w:lastRenderedPageBreak/>
-              <w:t>*Software Developer</w:t>
+              <w:t xml:space="preserve">(Complete) (New) </w:t>
+            </w:r>
+            <w:r>
+              <w:rPr>
+                <w:rFonts w:ascii="Aptos" w:eastAsia="Times New Roman" w:hAnsi="Aptos" w:cs="Times New Roman"/>
+              </w:rPr>
+              <w:t>Software Developer</w:t>
             </w:r>
           </w:p>
         </w:tc>
@@ -4552,6 +4614,113 @@
                 <w:rFonts w:ascii="Aptos" w:eastAsia="Times New Roman" w:hAnsi="Aptos" w:cs="Times New Roman"/>
               </w:rPr>
               <w:t>6 sprints, 1 person, 20 hours</w:t>
+            </w:r>
+          </w:p>
+        </w:tc>
+      </w:tr>
+      <w:tr>
+        <w:trPr>
+          <w:cnfStyle w:val="000000100000" w:firstRow="0" w:lastRow="0" w:firstColumn="0" w:lastColumn="0" w:oddVBand="0" w:evenVBand="0" w:oddHBand="1" w:evenHBand="0" w:firstRowFirstColumn="0" w:firstRowLastColumn="0" w:lastRowFirstColumn="0" w:lastRowLastColumn="0"/>
+          <w:trHeight w:val="1440"/>
+          <w:jc w:val="center"/>
+        </w:trPr>
+        <w:tc>
+          <w:tcPr>
+            <w:cnfStyle w:val="001000000000" w:firstRow="0" w:lastRow="0" w:firstColumn="1" w:lastColumn="0" w:oddVBand="0" w:evenVBand="0" w:oddHBand="0" w:evenHBand="0" w:firstRowFirstColumn="0" w:firstRowLastColumn="0" w:lastRowFirstColumn="0" w:lastRowLastColumn="0"/>
+            <w:tcW w:w="2102" w:type="dxa"/>
+            <w:vAlign w:val="center"/>
+          </w:tcPr>
+          <w:p>
+            <w:pPr>
+              <w:jc w:val="center"/>
+              <w:textAlignment w:val="baseline"/>
+              <w:rPr>
+                <w:rFonts w:ascii="Aptos" w:eastAsia="Times New Roman" w:hAnsi="Aptos" w:cs="Times New Roman"/>
+              </w:rPr>
+            </w:pPr>
+            <w:r>
+              <w:rPr>
+                <w:rFonts w:ascii="Aptos" w:eastAsia="Times New Roman" w:hAnsi="Aptos" w:cs="Times New Roman"/>
+              </w:rPr>
+              <w:t xml:space="preserve">(Complete) (New) </w:t>
+            </w:r>
+            <w:r>
+              <w:rPr>
+                <w:rFonts w:ascii="Aptos" w:eastAsia="Times New Roman" w:hAnsi="Aptos" w:cs="Times New Roman"/>
+              </w:rPr>
+              <w:t>Medicaid Employee</w:t>
+            </w:r>
+          </w:p>
+        </w:tc>
+        <w:tc>
+          <w:tcPr>
+            <w:tcW w:w="3972" w:type="dxa"/>
+            <w:vAlign w:val="center"/>
+          </w:tcPr>
+          <w:p>
+            <w:pPr>
+              <w:jc w:val="center"/>
+              <w:textAlignment w:val="baseline"/>
+              <w:cnfStyle w:val="000000100000" w:firstRow="0" w:lastRow="0" w:firstColumn="0" w:lastColumn="0" w:oddVBand="0" w:evenVBand="0" w:oddHBand="1" w:evenHBand="0" w:firstRowFirstColumn="0" w:firstRowLastColumn="0" w:lastRowFirstColumn="0" w:lastRowLastColumn="0"/>
+              <w:rPr>
+                <w:rFonts w:ascii="Aptos" w:eastAsia="Times New Roman" w:hAnsi="Aptos" w:cs="Times New Roman"/>
+              </w:rPr>
+            </w:pPr>
+            <w:r>
+              <w:rPr>
+                <w:rFonts w:ascii="Aptos" w:eastAsia="Times New Roman" w:hAnsi="Aptos" w:cs="Times New Roman"/>
+              </w:rPr>
+              <w:t>As a Medicaid employee, I want to have access to a dashboard that organizes applicant data so that I can more easily review their applications.</w:t>
+            </w:r>
+          </w:p>
+        </w:tc>
+        <w:tc>
+          <w:tcPr>
+            <w:tcW w:w="1496" w:type="dxa"/>
+            <w:vAlign w:val="center"/>
+          </w:tcPr>
+          <w:p>
+            <w:pPr>
+              <w:jc w:val="center"/>
+              <w:textAlignment w:val="baseline"/>
+              <w:cnfStyle w:val="000000100000" w:firstRow="0" w:lastRow="0" w:firstColumn="0" w:lastColumn="0" w:oddVBand="0" w:evenVBand="0" w:oddHBand="1" w:evenHBand="0" w:firstRowFirstColumn="0" w:firstRowLastColumn="0" w:lastRowFirstColumn="0" w:lastRowLastColumn="0"/>
+              <w:rPr>
+                <w:rFonts w:ascii="Aptos" w:eastAsia="Times New Roman" w:hAnsi="Aptos" w:cs="Times New Roman"/>
+              </w:rPr>
+            </w:pPr>
+            <w:r>
+              <w:rPr>
+                <w:rFonts w:ascii="Aptos" w:eastAsia="Times New Roman" w:hAnsi="Aptos" w:cs="Times New Roman"/>
+              </w:rPr>
+              <w:t>Medium</w:t>
+            </w:r>
+          </w:p>
+        </w:tc>
+        <w:tc>
+          <w:tcPr>
+            <w:tcW w:w="1780" w:type="dxa"/>
+            <w:vAlign w:val="center"/>
+          </w:tcPr>
+          <w:p>
+            <w:pPr>
+              <w:jc w:val="center"/>
+              <w:textAlignment w:val="baseline"/>
+              <w:cnfStyle w:val="000000100000" w:firstRow="0" w:lastRow="0" w:firstColumn="0" w:lastColumn="0" w:oddVBand="0" w:evenVBand="0" w:oddHBand="1" w:evenHBand="0" w:firstRowFirstColumn="0" w:firstRowLastColumn="0" w:lastRowFirstColumn="0" w:lastRowLastColumn="0"/>
+              <w:rPr>
+                <w:rFonts w:ascii="Aptos" w:eastAsia="Times New Roman" w:hAnsi="Aptos" w:cs="Times New Roman"/>
+              </w:rPr>
+            </w:pPr>
+            <w:r>
+              <w:rPr>
+                <w:rFonts w:ascii="Aptos" w:eastAsia="Times New Roman" w:hAnsi="Aptos" w:cs="Times New Roman"/>
+              </w:rPr>
+              <w:t>1 sprint, 1 person, 15</w:t>
+            </w:r>
+            <w:r>
+              <w:rPr>
+                <w:rFonts w:ascii="Aptos" w:eastAsia="Times New Roman" w:hAnsi="Aptos" w:cs="Times New Roman"/>
+              </w:rPr>
+              <w:t xml:space="preserve"> hours</w:t>
             </w:r>
           </w:p>
         </w:tc>

</xml_diff>

<commit_message>
Josh - Updated user stories for Sprint 4.
</commit_message>
<xml_diff>
--- a/AdditionalDocuments/User Stories.docx
+++ b/AdditionalDocuments/User Stories.docx
@@ -1806,7 +1806,25 @@
                 <w:kern w:val="0"/>
                 <w14:ligatures w14:val="none"/>
               </w:rPr>
-              <w:t xml:space="preserve"> sprint, 2 people, 12 hours </w:t>
+              <w:t xml:space="preserve"> </w:t>
+            </w:r>
+            <w:proofErr w:type="gramStart"/>
+            <w:r>
+              <w:rPr>
+                <w:rFonts w:ascii="Aptos" w:eastAsia="Times New Roman" w:hAnsi="Aptos" w:cs="Times New Roman"/>
+                <w:kern w:val="0"/>
+                <w14:ligatures w14:val="none"/>
+              </w:rPr>
+              <w:t>sprint</w:t>
+            </w:r>
+            <w:proofErr w:type="gramEnd"/>
+            <w:r>
+              <w:rPr>
+                <w:rFonts w:ascii="Aptos" w:eastAsia="Times New Roman" w:hAnsi="Aptos" w:cs="Times New Roman"/>
+                <w:kern w:val="0"/>
+                <w14:ligatures w14:val="none"/>
+              </w:rPr>
+              <w:t>, 2 people, 12 hours </w:t>
             </w:r>
           </w:p>
         </w:tc>
@@ -2299,7 +2317,25 @@
                 <w:kern w:val="0"/>
                 <w14:ligatures w14:val="none"/>
               </w:rPr>
-              <w:t xml:space="preserve"> sprint, 1 person, 8 hours</w:t>
+              <w:t xml:space="preserve"> </w:t>
+            </w:r>
+            <w:proofErr w:type="gramStart"/>
+            <w:r>
+              <w:rPr>
+                <w:rFonts w:ascii="Times New Roman" w:eastAsia="Times New Roman" w:hAnsi="Times New Roman" w:cs="Times New Roman"/>
+                <w:kern w:val="0"/>
+                <w14:ligatures w14:val="none"/>
+              </w:rPr>
+              <w:t>sprint</w:t>
+            </w:r>
+            <w:proofErr w:type="gramEnd"/>
+            <w:r>
+              <w:rPr>
+                <w:rFonts w:ascii="Times New Roman" w:eastAsia="Times New Roman" w:hAnsi="Times New Roman" w:cs="Times New Roman"/>
+                <w:kern w:val="0"/>
+                <w14:ligatures w14:val="none"/>
+              </w:rPr>
+              <w:t>, 1 person, 8 hours</w:t>
             </w:r>
           </w:p>
         </w:tc>
@@ -2433,7 +2469,25 @@
                 <w:kern w:val="0"/>
                 <w14:ligatures w14:val="none"/>
               </w:rPr>
-              <w:t xml:space="preserve"> sprint, 1 person, 6 hours</w:t>
+              <w:t xml:space="preserve"> </w:t>
+            </w:r>
+            <w:proofErr w:type="gramStart"/>
+            <w:r>
+              <w:rPr>
+                <w:rFonts w:ascii="Times New Roman" w:eastAsia="Times New Roman" w:hAnsi="Times New Roman" w:cs="Times New Roman"/>
+                <w:kern w:val="0"/>
+                <w14:ligatures w14:val="none"/>
+              </w:rPr>
+              <w:t>sprint</w:t>
+            </w:r>
+            <w:proofErr w:type="gramEnd"/>
+            <w:r>
+              <w:rPr>
+                <w:rFonts w:ascii="Times New Roman" w:eastAsia="Times New Roman" w:hAnsi="Times New Roman" w:cs="Times New Roman"/>
+                <w:kern w:val="0"/>
+                <w14:ligatures w14:val="none"/>
+              </w:rPr>
+              <w:t>, 1 person, 6 hours</w:t>
             </w:r>
           </w:p>
         </w:tc>
@@ -2671,21 +2725,6 @@
       <w:r>
         <w:lastRenderedPageBreak/>
         <w:t>Sprint 3</w:t>
-      </w:r>
-    </w:p>
-    <w:p/>
-    <w:p>
-      <w:pPr>
-        <w:pStyle w:val="Heading2"/>
-      </w:pPr>
-      <w:r>
-        <w:t>In-Scope</w:t>
-      </w:r>
-      <w:r>
-        <w:t xml:space="preserve"> (New stories are prefaced with the * asterisk)</w:t>
-      </w:r>
-      <w:r>
-        <w:t>:</w:t>
       </w:r>
     </w:p>
     <w:p/>
@@ -3150,7 +3189,25 @@
                 <w:kern w:val="0"/>
                 <w14:ligatures w14:val="none"/>
               </w:rPr>
-              <w:t xml:space="preserve">2 sprint, 1 person, </w:t>
+              <w:t xml:space="preserve">2 </w:t>
+            </w:r>
+            <w:proofErr w:type="gramStart"/>
+            <w:r>
+              <w:rPr>
+                <w:rFonts w:ascii="Aptos" w:eastAsia="Times New Roman" w:hAnsi="Aptos" w:cs="Times New Roman"/>
+                <w:kern w:val="0"/>
+                <w14:ligatures w14:val="none"/>
+              </w:rPr>
+              <w:t>sprint</w:t>
+            </w:r>
+            <w:proofErr w:type="gramEnd"/>
+            <w:r>
+              <w:rPr>
+                <w:rFonts w:ascii="Aptos" w:eastAsia="Times New Roman" w:hAnsi="Aptos" w:cs="Times New Roman"/>
+                <w:kern w:val="0"/>
+                <w14:ligatures w14:val="none"/>
+              </w:rPr>
+              <w:t xml:space="preserve">, 1 person, </w:t>
             </w:r>
             <w:r>
               <w:rPr>
@@ -3633,7 +3690,21 @@
               <w:rPr>
                 <w:rFonts w:ascii="Aptos" w:eastAsia="Times New Roman" w:hAnsi="Aptos" w:cs="Times New Roman"/>
               </w:rPr>
-              <w:t>As a Medicaid Applicant, I want to be able to upload additional documentation if the person reviewing my application requests it.</w:t>
+              <w:t xml:space="preserve">As a Medicaid Applicant, I want to be able to upload additional documentation if the person </w:t>
+            </w:r>
+            <w:proofErr w:type="gramStart"/>
+            <w:r>
+              <w:rPr>
+                <w:rFonts w:ascii="Aptos" w:eastAsia="Times New Roman" w:hAnsi="Aptos" w:cs="Times New Roman"/>
+              </w:rPr>
+              <w:t>reviewing</w:t>
+            </w:r>
+            <w:proofErr w:type="gramEnd"/>
+            <w:r>
+              <w:rPr>
+                <w:rFonts w:ascii="Aptos" w:eastAsia="Times New Roman" w:hAnsi="Aptos" w:cs="Times New Roman"/>
+              </w:rPr>
+              <w:t xml:space="preserve"> my application requests it.</w:t>
             </w:r>
           </w:p>
         </w:tc>
@@ -3800,7 +3871,25 @@
                 <w:kern w:val="0"/>
                 <w14:ligatures w14:val="none"/>
               </w:rPr>
-              <w:t xml:space="preserve"> sprint, 2 people, 12 hours </w:t>
+              <w:t xml:space="preserve"> </w:t>
+            </w:r>
+            <w:proofErr w:type="gramStart"/>
+            <w:r>
+              <w:rPr>
+                <w:rFonts w:ascii="Aptos" w:eastAsia="Times New Roman" w:hAnsi="Aptos" w:cs="Times New Roman"/>
+                <w:kern w:val="0"/>
+                <w14:ligatures w14:val="none"/>
+              </w:rPr>
+              <w:t>sprint</w:t>
+            </w:r>
+            <w:proofErr w:type="gramEnd"/>
+            <w:r>
+              <w:rPr>
+                <w:rFonts w:ascii="Aptos" w:eastAsia="Times New Roman" w:hAnsi="Aptos" w:cs="Times New Roman"/>
+                <w:kern w:val="0"/>
+                <w14:ligatures w14:val="none"/>
+              </w:rPr>
+              <w:t>, 2 people, 12 hours </w:t>
             </w:r>
           </w:p>
         </w:tc>
@@ -4219,7 +4308,21 @@
               <w:rPr>
                 <w:rFonts w:ascii="Aptos" w:eastAsia="Times New Roman" w:hAnsi="Aptos" w:cs="Times New Roman"/>
               </w:rPr>
-              <w:t>As a documentation specialist on this project, I want all of the documentation to be readily available and up to date in the GitHub repository.</w:t>
+              <w:t xml:space="preserve">As a documentation specialist on this project, I want </w:t>
+            </w:r>
+            <w:proofErr w:type="gramStart"/>
+            <w:r>
+              <w:rPr>
+                <w:rFonts w:ascii="Aptos" w:eastAsia="Times New Roman" w:hAnsi="Aptos" w:cs="Times New Roman"/>
+              </w:rPr>
+              <w:t>all of</w:t>
+            </w:r>
+            <w:proofErr w:type="gramEnd"/>
+            <w:r>
+              <w:rPr>
+                <w:rFonts w:ascii="Aptos" w:eastAsia="Times New Roman" w:hAnsi="Aptos" w:cs="Times New Roman"/>
+              </w:rPr>
+              <w:t xml:space="preserve"> the documentation to be readily available and up to date in the GitHub repository.</w:t>
             </w:r>
           </w:p>
         </w:tc>
@@ -4269,7 +4372,21 @@
               <w:rPr>
                 <w:rFonts w:ascii="Aptos" w:eastAsia="Times New Roman" w:hAnsi="Aptos" w:cs="Times New Roman"/>
               </w:rPr>
-              <w:t xml:space="preserve"> sprint, 1 person, 2 hours</w:t>
+              <w:t xml:space="preserve"> </w:t>
+            </w:r>
+            <w:proofErr w:type="gramStart"/>
+            <w:r>
+              <w:rPr>
+                <w:rFonts w:ascii="Aptos" w:eastAsia="Times New Roman" w:hAnsi="Aptos" w:cs="Times New Roman"/>
+              </w:rPr>
+              <w:t>sprint</w:t>
+            </w:r>
+            <w:proofErr w:type="gramEnd"/>
+            <w:r>
+              <w:rPr>
+                <w:rFonts w:ascii="Aptos" w:eastAsia="Times New Roman" w:hAnsi="Aptos" w:cs="Times New Roman"/>
+              </w:rPr>
+              <w:t>, 1 person, 2 hours</w:t>
             </w:r>
           </w:p>
         </w:tc>
@@ -4721,6 +4838,2109 @@
                 <w:rFonts w:ascii="Aptos" w:eastAsia="Times New Roman" w:hAnsi="Aptos" w:cs="Times New Roman"/>
               </w:rPr>
               <w:t xml:space="preserve"> hours</w:t>
+            </w:r>
+          </w:p>
+        </w:tc>
+      </w:tr>
+    </w:tbl>
+    <w:p/>
+    <w:p/>
+    <w:p>
+      <w:pPr>
+        <w:pStyle w:val="Heading1"/>
+      </w:pPr>
+      <w:r>
+        <w:t>Sprint 3</w:t>
+      </w:r>
+    </w:p>
+    <w:tbl>
+      <w:tblPr>
+        <w:tblStyle w:val="GridTable5Dark-Accent1"/>
+        <w:tblW w:w="9350" w:type="dxa"/>
+        <w:jc w:val="center"/>
+        <w:tblLook w:val="04A0" w:firstRow="1" w:lastRow="0" w:firstColumn="1" w:lastColumn="0" w:noHBand="0" w:noVBand="1"/>
+      </w:tblPr>
+      <w:tblGrid>
+        <w:gridCol w:w="2102"/>
+        <w:gridCol w:w="3972"/>
+        <w:gridCol w:w="1496"/>
+        <w:gridCol w:w="1780"/>
+      </w:tblGrid>
+      <w:tr>
+        <w:trPr>
+          <w:cnfStyle w:val="100000000000" w:firstRow="1" w:lastRow="0" w:firstColumn="0" w:lastColumn="0" w:oddVBand="0" w:evenVBand="0" w:oddHBand="0" w:evenHBand="0" w:firstRowFirstColumn="0" w:firstRowLastColumn="0" w:lastRowFirstColumn="0" w:lastRowLastColumn="0"/>
+          <w:trHeight w:val="570"/>
+          <w:jc w:val="center"/>
+        </w:trPr>
+        <w:tc>
+          <w:tcPr>
+            <w:cnfStyle w:val="001000000000" w:firstRow="0" w:lastRow="0" w:firstColumn="1" w:lastColumn="0" w:oddVBand="0" w:evenVBand="0" w:oddHBand="0" w:evenHBand="0" w:firstRowFirstColumn="0" w:firstRowLastColumn="0" w:lastRowFirstColumn="0" w:lastRowLastColumn="0"/>
+            <w:tcW w:w="2102" w:type="dxa"/>
+            <w:vAlign w:val="center"/>
+            <w:hideMark/>
+          </w:tcPr>
+          <w:p>
+            <w:pPr>
+              <w:ind w:left="360"/>
+              <w:jc w:val="center"/>
+              <w:textAlignment w:val="baseline"/>
+              <w:rPr>
+                <w:rFonts w:ascii="Times New Roman" w:eastAsia="Times New Roman" w:hAnsi="Times New Roman" w:cs="Times New Roman"/>
+                <w:kern w:val="0"/>
+                <w14:ligatures w14:val="none"/>
+              </w:rPr>
+            </w:pPr>
+            <w:r>
+              <w:rPr>
+                <w:rFonts w:ascii="Aptos" w:eastAsia="Times New Roman" w:hAnsi="Aptos" w:cs="Times New Roman"/>
+                <w:kern w:val="0"/>
+                <w14:ligatures w14:val="none"/>
+              </w:rPr>
+              <w:t>User Story </w:t>
+            </w:r>
+          </w:p>
+        </w:tc>
+        <w:tc>
+          <w:tcPr>
+            <w:tcW w:w="3972" w:type="dxa"/>
+            <w:vAlign w:val="center"/>
+            <w:hideMark/>
+          </w:tcPr>
+          <w:p>
+            <w:pPr>
+              <w:jc w:val="center"/>
+              <w:textAlignment w:val="baseline"/>
+              <w:cnfStyle w:val="100000000000" w:firstRow="1" w:lastRow="0" w:firstColumn="0" w:lastColumn="0" w:oddVBand="0" w:evenVBand="0" w:oddHBand="0" w:evenHBand="0" w:firstRowFirstColumn="0" w:firstRowLastColumn="0" w:lastRowFirstColumn="0" w:lastRowLastColumn="0"/>
+              <w:rPr>
+                <w:rFonts w:ascii="Times New Roman" w:eastAsia="Times New Roman" w:hAnsi="Times New Roman" w:cs="Times New Roman"/>
+                <w:kern w:val="0"/>
+                <w14:ligatures w14:val="none"/>
+              </w:rPr>
+            </w:pPr>
+            <w:r>
+              <w:rPr>
+                <w:rFonts w:ascii="Aptos" w:eastAsia="Times New Roman" w:hAnsi="Aptos" w:cs="Times New Roman"/>
+                <w:kern w:val="0"/>
+                <w14:ligatures w14:val="none"/>
+              </w:rPr>
+              <w:t>Description </w:t>
+            </w:r>
+          </w:p>
+        </w:tc>
+        <w:tc>
+          <w:tcPr>
+            <w:tcW w:w="1496" w:type="dxa"/>
+            <w:vAlign w:val="center"/>
+            <w:hideMark/>
+          </w:tcPr>
+          <w:p>
+            <w:pPr>
+              <w:jc w:val="center"/>
+              <w:textAlignment w:val="baseline"/>
+              <w:cnfStyle w:val="100000000000" w:firstRow="1" w:lastRow="0" w:firstColumn="0" w:lastColumn="0" w:oddVBand="0" w:evenVBand="0" w:oddHBand="0" w:evenHBand="0" w:firstRowFirstColumn="0" w:firstRowLastColumn="0" w:lastRowFirstColumn="0" w:lastRowLastColumn="0"/>
+              <w:rPr>
+                <w:rFonts w:ascii="Times New Roman" w:eastAsia="Times New Roman" w:hAnsi="Times New Roman" w:cs="Times New Roman"/>
+                <w:kern w:val="0"/>
+                <w14:ligatures w14:val="none"/>
+              </w:rPr>
+            </w:pPr>
+            <w:r>
+              <w:rPr>
+                <w:rFonts w:ascii="Aptos" w:eastAsia="Times New Roman" w:hAnsi="Aptos" w:cs="Times New Roman"/>
+                <w:kern w:val="0"/>
+                <w14:ligatures w14:val="none"/>
+              </w:rPr>
+              <w:t>Priority </w:t>
+            </w:r>
+          </w:p>
+        </w:tc>
+        <w:tc>
+          <w:tcPr>
+            <w:tcW w:w="1780" w:type="dxa"/>
+            <w:vAlign w:val="center"/>
+            <w:hideMark/>
+          </w:tcPr>
+          <w:p>
+            <w:pPr>
+              <w:jc w:val="center"/>
+              <w:textAlignment w:val="baseline"/>
+              <w:cnfStyle w:val="100000000000" w:firstRow="1" w:lastRow="0" w:firstColumn="0" w:lastColumn="0" w:oddVBand="0" w:evenVBand="0" w:oddHBand="0" w:evenHBand="0" w:firstRowFirstColumn="0" w:firstRowLastColumn="0" w:lastRowFirstColumn="0" w:lastRowLastColumn="0"/>
+              <w:rPr>
+                <w:rFonts w:ascii="Times New Roman" w:eastAsia="Times New Roman" w:hAnsi="Times New Roman" w:cs="Times New Roman"/>
+                <w:kern w:val="0"/>
+                <w14:ligatures w14:val="none"/>
+              </w:rPr>
+            </w:pPr>
+            <w:r>
+              <w:rPr>
+                <w:rFonts w:ascii="Aptos" w:eastAsia="Times New Roman" w:hAnsi="Aptos" w:cs="Times New Roman"/>
+                <w:kern w:val="0"/>
+                <w14:ligatures w14:val="none"/>
+              </w:rPr>
+              <w:t>Time Required </w:t>
+            </w:r>
+          </w:p>
+        </w:tc>
+      </w:tr>
+      <w:tr>
+        <w:trPr>
+          <w:cnfStyle w:val="000000100000" w:firstRow="0" w:lastRow="0" w:firstColumn="0" w:lastColumn="0" w:oddVBand="0" w:evenVBand="0" w:oddHBand="1" w:evenHBand="0" w:firstRowFirstColumn="0" w:firstRowLastColumn="0" w:lastRowFirstColumn="0" w:lastRowLastColumn="0"/>
+          <w:trHeight w:val="1440"/>
+          <w:jc w:val="center"/>
+        </w:trPr>
+        <w:tc>
+          <w:tcPr>
+            <w:cnfStyle w:val="001000000000" w:firstRow="0" w:lastRow="0" w:firstColumn="1" w:lastColumn="0" w:oddVBand="0" w:evenVBand="0" w:oddHBand="0" w:evenHBand="0" w:firstRowFirstColumn="0" w:firstRowLastColumn="0" w:lastRowFirstColumn="0" w:lastRowLastColumn="0"/>
+            <w:tcW w:w="2102" w:type="dxa"/>
+            <w:vAlign w:val="center"/>
+            <w:hideMark/>
+          </w:tcPr>
+          <w:p>
+            <w:pPr>
+              <w:jc w:val="center"/>
+              <w:textAlignment w:val="baseline"/>
+              <w:rPr>
+                <w:rFonts w:ascii="Times New Roman" w:eastAsia="Times New Roman" w:hAnsi="Times New Roman" w:cs="Times New Roman"/>
+                <w:kern w:val="0"/>
+                <w14:ligatures w14:val="none"/>
+              </w:rPr>
+            </w:pPr>
+            <w:r>
+              <w:rPr>
+                <w:rFonts w:ascii="Aptos" w:eastAsia="Times New Roman" w:hAnsi="Aptos" w:cs="Times New Roman"/>
+                <w:kern w:val="0"/>
+                <w14:ligatures w14:val="none"/>
+              </w:rPr>
+              <w:t>Medicaid Employee </w:t>
+            </w:r>
+          </w:p>
+        </w:tc>
+        <w:tc>
+          <w:tcPr>
+            <w:tcW w:w="3972" w:type="dxa"/>
+            <w:vAlign w:val="center"/>
+            <w:hideMark/>
+          </w:tcPr>
+          <w:p>
+            <w:pPr>
+              <w:jc w:val="center"/>
+              <w:textAlignment w:val="baseline"/>
+              <w:cnfStyle w:val="000000100000" w:firstRow="0" w:lastRow="0" w:firstColumn="0" w:lastColumn="0" w:oddVBand="0" w:evenVBand="0" w:oddHBand="1" w:evenHBand="0" w:firstRowFirstColumn="0" w:firstRowLastColumn="0" w:lastRowFirstColumn="0" w:lastRowLastColumn="0"/>
+              <w:rPr>
+                <w:rFonts w:ascii="Times New Roman" w:eastAsia="Times New Roman" w:hAnsi="Times New Roman" w:cs="Times New Roman"/>
+                <w:kern w:val="0"/>
+                <w14:ligatures w14:val="none"/>
+              </w:rPr>
+            </w:pPr>
+            <w:r>
+              <w:rPr>
+                <w:rFonts w:ascii="Aptos" w:eastAsia="Times New Roman" w:hAnsi="Aptos" w:cs="Times New Roman"/>
+                <w:kern w:val="0"/>
+                <w14:ligatures w14:val="none"/>
+              </w:rPr>
+              <w:t xml:space="preserve">As a Medicaid employee, I want </w:t>
+            </w:r>
+            <w:r>
+              <w:rPr>
+                <w:rFonts w:ascii="Aptos" w:eastAsia="Times New Roman" w:hAnsi="Aptos" w:cs="Times New Roman"/>
+                <w:kern w:val="0"/>
+                <w14:ligatures w14:val="none"/>
+              </w:rPr>
+              <w:t xml:space="preserve">to view </w:t>
+            </w:r>
+            <w:r>
+              <w:rPr>
+                <w:rFonts w:ascii="Aptos" w:eastAsia="Times New Roman" w:hAnsi="Aptos" w:cs="Times New Roman"/>
+                <w:kern w:val="0"/>
+                <w14:ligatures w14:val="none"/>
+              </w:rPr>
+              <w:t>upload</w:t>
+            </w:r>
+            <w:r>
+              <w:rPr>
+                <w:rFonts w:ascii="Aptos" w:eastAsia="Times New Roman" w:hAnsi="Aptos" w:cs="Times New Roman"/>
+                <w:kern w:val="0"/>
+                <w14:ligatures w14:val="none"/>
+              </w:rPr>
+              <w:t>ed</w:t>
+            </w:r>
+            <w:r>
+              <w:rPr>
+                <w:rFonts w:ascii="Aptos" w:eastAsia="Times New Roman" w:hAnsi="Aptos" w:cs="Times New Roman"/>
+                <w:kern w:val="0"/>
+                <w14:ligatures w14:val="none"/>
+              </w:rPr>
+              <w:t xml:space="preserve"> documents so that I can verify them against the qualification criteria. </w:t>
+            </w:r>
+          </w:p>
+        </w:tc>
+        <w:tc>
+          <w:tcPr>
+            <w:tcW w:w="1496" w:type="dxa"/>
+            <w:vAlign w:val="center"/>
+            <w:hideMark/>
+          </w:tcPr>
+          <w:p>
+            <w:pPr>
+              <w:jc w:val="center"/>
+              <w:textAlignment w:val="baseline"/>
+              <w:cnfStyle w:val="000000100000" w:firstRow="0" w:lastRow="0" w:firstColumn="0" w:lastColumn="0" w:oddVBand="0" w:evenVBand="0" w:oddHBand="1" w:evenHBand="0" w:firstRowFirstColumn="0" w:firstRowLastColumn="0" w:lastRowFirstColumn="0" w:lastRowLastColumn="0"/>
+              <w:rPr>
+                <w:rFonts w:ascii="Times New Roman" w:eastAsia="Times New Roman" w:hAnsi="Times New Roman" w:cs="Times New Roman"/>
+                <w:kern w:val="0"/>
+                <w14:ligatures w14:val="none"/>
+              </w:rPr>
+            </w:pPr>
+            <w:r>
+              <w:rPr>
+                <w:rFonts w:ascii="Aptos" w:eastAsia="Times New Roman" w:hAnsi="Aptos" w:cs="Times New Roman"/>
+                <w:kern w:val="0"/>
+                <w14:ligatures w14:val="none"/>
+              </w:rPr>
+              <w:t>High </w:t>
+            </w:r>
+          </w:p>
+        </w:tc>
+        <w:tc>
+          <w:tcPr>
+            <w:tcW w:w="1780" w:type="dxa"/>
+            <w:vAlign w:val="center"/>
+            <w:hideMark/>
+          </w:tcPr>
+          <w:p>
+            <w:pPr>
+              <w:jc w:val="center"/>
+              <w:textAlignment w:val="baseline"/>
+              <w:cnfStyle w:val="000000100000" w:firstRow="0" w:lastRow="0" w:firstColumn="0" w:lastColumn="0" w:oddVBand="0" w:evenVBand="0" w:oddHBand="1" w:evenHBand="0" w:firstRowFirstColumn="0" w:firstRowLastColumn="0" w:lastRowFirstColumn="0" w:lastRowLastColumn="0"/>
+              <w:rPr>
+                <w:rFonts w:ascii="Times New Roman" w:eastAsia="Times New Roman" w:hAnsi="Times New Roman" w:cs="Times New Roman"/>
+                <w:kern w:val="0"/>
+                <w14:ligatures w14:val="none"/>
+              </w:rPr>
+            </w:pPr>
+            <w:r>
+              <w:rPr>
+                <w:rFonts w:ascii="Aptos" w:eastAsia="Times New Roman" w:hAnsi="Aptos" w:cs="Times New Roman"/>
+                <w:kern w:val="0"/>
+                <w14:ligatures w14:val="none"/>
+              </w:rPr>
+              <w:t>2</w:t>
+            </w:r>
+            <w:r>
+              <w:rPr>
+                <w:rFonts w:ascii="Aptos" w:eastAsia="Times New Roman" w:hAnsi="Aptos" w:cs="Times New Roman"/>
+                <w:kern w:val="0"/>
+                <w14:ligatures w14:val="none"/>
+              </w:rPr>
+              <w:t xml:space="preserve"> sprint, 1 person, </w:t>
+            </w:r>
+            <w:r>
+              <w:rPr>
+                <w:rFonts w:ascii="Aptos" w:eastAsia="Times New Roman" w:hAnsi="Aptos" w:cs="Times New Roman"/>
+                <w:kern w:val="0"/>
+                <w14:ligatures w14:val="none"/>
+              </w:rPr>
+              <w:t>12</w:t>
+            </w:r>
+            <w:r>
+              <w:rPr>
+                <w:rFonts w:ascii="Aptos" w:eastAsia="Times New Roman" w:hAnsi="Aptos" w:cs="Times New Roman"/>
+                <w:kern w:val="0"/>
+                <w14:ligatures w14:val="none"/>
+              </w:rPr>
+              <w:t xml:space="preserve"> hours </w:t>
+            </w:r>
+          </w:p>
+        </w:tc>
+      </w:tr>
+      <w:tr>
+        <w:trPr>
+          <w:trHeight w:val="1440"/>
+          <w:jc w:val="center"/>
+        </w:trPr>
+        <w:tc>
+          <w:tcPr>
+            <w:cnfStyle w:val="001000000000" w:firstRow="0" w:lastRow="0" w:firstColumn="1" w:lastColumn="0" w:oddVBand="0" w:evenVBand="0" w:oddHBand="0" w:evenHBand="0" w:firstRowFirstColumn="0" w:firstRowLastColumn="0" w:lastRowFirstColumn="0" w:lastRowLastColumn="0"/>
+            <w:tcW w:w="2102" w:type="dxa"/>
+            <w:vAlign w:val="center"/>
+            <w:hideMark/>
+          </w:tcPr>
+          <w:p>
+            <w:pPr>
+              <w:jc w:val="center"/>
+              <w:textAlignment w:val="baseline"/>
+              <w:rPr>
+                <w:rFonts w:ascii="Times New Roman" w:eastAsia="Times New Roman" w:hAnsi="Times New Roman" w:cs="Times New Roman"/>
+                <w:kern w:val="0"/>
+                <w14:ligatures w14:val="none"/>
+              </w:rPr>
+            </w:pPr>
+            <w:r>
+              <w:rPr>
+                <w:rFonts w:ascii="Aptos" w:eastAsia="Times New Roman" w:hAnsi="Aptos" w:cs="Times New Roman"/>
+                <w:kern w:val="0"/>
+                <w14:ligatures w14:val="none"/>
+              </w:rPr>
+              <w:t>Medicaid Applicant </w:t>
+            </w:r>
+          </w:p>
+        </w:tc>
+        <w:tc>
+          <w:tcPr>
+            <w:tcW w:w="3972" w:type="dxa"/>
+            <w:vAlign w:val="center"/>
+            <w:hideMark/>
+          </w:tcPr>
+          <w:p>
+            <w:pPr>
+              <w:jc w:val="center"/>
+              <w:textAlignment w:val="baseline"/>
+              <w:cnfStyle w:val="000000000000" w:firstRow="0" w:lastRow="0" w:firstColumn="0" w:lastColumn="0" w:oddVBand="0" w:evenVBand="0" w:oddHBand="0" w:evenHBand="0" w:firstRowFirstColumn="0" w:firstRowLastColumn="0" w:lastRowFirstColumn="0" w:lastRowLastColumn="0"/>
+              <w:rPr>
+                <w:rFonts w:ascii="Times New Roman" w:eastAsia="Times New Roman" w:hAnsi="Times New Roman" w:cs="Times New Roman"/>
+                <w:kern w:val="0"/>
+                <w14:ligatures w14:val="none"/>
+              </w:rPr>
+            </w:pPr>
+            <w:r>
+              <w:rPr>
+                <w:rFonts w:ascii="Aptos" w:eastAsia="Times New Roman" w:hAnsi="Aptos" w:cs="Times New Roman"/>
+                <w:kern w:val="0"/>
+                <w14:ligatures w14:val="none"/>
+              </w:rPr>
+              <w:t xml:space="preserve">As someone who doesn’t know much about Medicaid or the process to get approval, I want to learn more about the program </w:t>
+            </w:r>
+            <w:r>
+              <w:rPr>
+                <w:rFonts w:ascii="Aptos" w:eastAsia="Times New Roman" w:hAnsi="Aptos" w:cs="Times New Roman"/>
+                <w:kern w:val="0"/>
+                <w14:ligatures w14:val="none"/>
+              </w:rPr>
+              <w:t xml:space="preserve">through the MEVA app </w:t>
+            </w:r>
+            <w:r>
+              <w:rPr>
+                <w:rFonts w:ascii="Aptos" w:eastAsia="Times New Roman" w:hAnsi="Aptos" w:cs="Times New Roman"/>
+                <w:kern w:val="0"/>
+                <w14:ligatures w14:val="none"/>
+              </w:rPr>
+              <w:t xml:space="preserve">so that I can </w:t>
+            </w:r>
+            <w:r>
+              <w:rPr>
+                <w:rFonts w:ascii="Aptos" w:eastAsia="Times New Roman" w:hAnsi="Aptos" w:cs="Times New Roman"/>
+                <w:kern w:val="0"/>
+                <w14:ligatures w14:val="none"/>
+              </w:rPr>
+              <w:t xml:space="preserve">understand how to </w:t>
+            </w:r>
+            <w:r>
+              <w:rPr>
+                <w:rFonts w:ascii="Aptos" w:eastAsia="Times New Roman" w:hAnsi="Aptos" w:cs="Times New Roman"/>
+                <w:kern w:val="0"/>
+                <w14:ligatures w14:val="none"/>
+              </w:rPr>
+              <w:t>get the proper coverage. </w:t>
+            </w:r>
+          </w:p>
+          <w:p>
+            <w:pPr>
+              <w:jc w:val="center"/>
+              <w:textAlignment w:val="baseline"/>
+              <w:cnfStyle w:val="000000000000" w:firstRow="0" w:lastRow="0" w:firstColumn="0" w:lastColumn="0" w:oddVBand="0" w:evenVBand="0" w:oddHBand="0" w:evenHBand="0" w:firstRowFirstColumn="0" w:firstRowLastColumn="0" w:lastRowFirstColumn="0" w:lastRowLastColumn="0"/>
+              <w:rPr>
+                <w:rFonts w:ascii="Times New Roman" w:eastAsia="Times New Roman" w:hAnsi="Times New Roman" w:cs="Times New Roman"/>
+                <w:kern w:val="0"/>
+                <w14:ligatures w14:val="none"/>
+              </w:rPr>
+            </w:pPr>
+            <w:r>
+              <w:rPr>
+                <w:rFonts w:ascii="Aptos" w:eastAsia="Times New Roman" w:hAnsi="Aptos" w:cs="Times New Roman"/>
+                <w:kern w:val="0"/>
+                <w14:ligatures w14:val="none"/>
+              </w:rPr>
+              <w:t> </w:t>
+            </w:r>
+          </w:p>
+        </w:tc>
+        <w:tc>
+          <w:tcPr>
+            <w:tcW w:w="1496" w:type="dxa"/>
+            <w:vAlign w:val="center"/>
+            <w:hideMark/>
+          </w:tcPr>
+          <w:p>
+            <w:pPr>
+              <w:jc w:val="center"/>
+              <w:textAlignment w:val="baseline"/>
+              <w:cnfStyle w:val="000000000000" w:firstRow="0" w:lastRow="0" w:firstColumn="0" w:lastColumn="0" w:oddVBand="0" w:evenVBand="0" w:oddHBand="0" w:evenHBand="0" w:firstRowFirstColumn="0" w:firstRowLastColumn="0" w:lastRowFirstColumn="0" w:lastRowLastColumn="0"/>
+              <w:rPr>
+                <w:rFonts w:ascii="Times New Roman" w:eastAsia="Times New Roman" w:hAnsi="Times New Roman" w:cs="Times New Roman"/>
+                <w:kern w:val="0"/>
+                <w14:ligatures w14:val="none"/>
+              </w:rPr>
+            </w:pPr>
+            <w:r>
+              <w:rPr>
+                <w:rFonts w:ascii="Aptos" w:eastAsia="Times New Roman" w:hAnsi="Aptos" w:cs="Times New Roman"/>
+                <w:kern w:val="0"/>
+                <w14:ligatures w14:val="none"/>
+              </w:rPr>
+              <w:t>High </w:t>
+            </w:r>
+          </w:p>
+        </w:tc>
+        <w:tc>
+          <w:tcPr>
+            <w:tcW w:w="1780" w:type="dxa"/>
+            <w:vAlign w:val="center"/>
+            <w:hideMark/>
+          </w:tcPr>
+          <w:p>
+            <w:pPr>
+              <w:jc w:val="center"/>
+              <w:textAlignment w:val="baseline"/>
+              <w:cnfStyle w:val="000000000000" w:firstRow="0" w:lastRow="0" w:firstColumn="0" w:lastColumn="0" w:oddVBand="0" w:evenVBand="0" w:oddHBand="0" w:evenHBand="0" w:firstRowFirstColumn="0" w:firstRowLastColumn="0" w:lastRowFirstColumn="0" w:lastRowLastColumn="0"/>
+              <w:rPr>
+                <w:rFonts w:ascii="Times New Roman" w:eastAsia="Times New Roman" w:hAnsi="Times New Roman" w:cs="Times New Roman"/>
+                <w:kern w:val="0"/>
+                <w14:ligatures w14:val="none"/>
+              </w:rPr>
+            </w:pPr>
+            <w:r>
+              <w:rPr>
+                <w:rFonts w:ascii="Aptos" w:eastAsia="Times New Roman" w:hAnsi="Aptos" w:cs="Times New Roman"/>
+                <w:kern w:val="0"/>
+                <w14:ligatures w14:val="none"/>
+              </w:rPr>
+              <w:t xml:space="preserve">2 </w:t>
+            </w:r>
+            <w:proofErr w:type="gramStart"/>
+            <w:r>
+              <w:rPr>
+                <w:rFonts w:ascii="Aptos" w:eastAsia="Times New Roman" w:hAnsi="Aptos" w:cs="Times New Roman"/>
+                <w:kern w:val="0"/>
+                <w14:ligatures w14:val="none"/>
+              </w:rPr>
+              <w:t>sprint</w:t>
+            </w:r>
+            <w:proofErr w:type="gramEnd"/>
+            <w:r>
+              <w:rPr>
+                <w:rFonts w:ascii="Aptos" w:eastAsia="Times New Roman" w:hAnsi="Aptos" w:cs="Times New Roman"/>
+                <w:kern w:val="0"/>
+                <w14:ligatures w14:val="none"/>
+              </w:rPr>
+              <w:t xml:space="preserve">, 1 person, </w:t>
+            </w:r>
+            <w:r>
+              <w:rPr>
+                <w:rFonts w:ascii="Aptos" w:eastAsia="Times New Roman" w:hAnsi="Aptos" w:cs="Times New Roman"/>
+                <w:kern w:val="0"/>
+                <w14:ligatures w14:val="none"/>
+              </w:rPr>
+              <w:t>10</w:t>
+            </w:r>
+            <w:r>
+              <w:rPr>
+                <w:rFonts w:ascii="Aptos" w:eastAsia="Times New Roman" w:hAnsi="Aptos" w:cs="Times New Roman"/>
+                <w:kern w:val="0"/>
+                <w14:ligatures w14:val="none"/>
+              </w:rPr>
+              <w:t xml:space="preserve"> hours </w:t>
+            </w:r>
+          </w:p>
+        </w:tc>
+      </w:tr>
+      <w:tr>
+        <w:trPr>
+          <w:cnfStyle w:val="000000100000" w:firstRow="0" w:lastRow="0" w:firstColumn="0" w:lastColumn="0" w:oddVBand="0" w:evenVBand="0" w:oddHBand="1" w:evenHBand="0" w:firstRowFirstColumn="0" w:firstRowLastColumn="0" w:lastRowFirstColumn="0" w:lastRowLastColumn="0"/>
+          <w:trHeight w:val="1440"/>
+          <w:jc w:val="center"/>
+        </w:trPr>
+        <w:tc>
+          <w:tcPr>
+            <w:cnfStyle w:val="001000000000" w:firstRow="0" w:lastRow="0" w:firstColumn="1" w:lastColumn="0" w:oddVBand="0" w:evenVBand="0" w:oddHBand="0" w:evenHBand="0" w:firstRowFirstColumn="0" w:firstRowLastColumn="0" w:lastRowFirstColumn="0" w:lastRowLastColumn="0"/>
+            <w:tcW w:w="2102" w:type="dxa"/>
+            <w:vAlign w:val="center"/>
+            <w:hideMark/>
+          </w:tcPr>
+          <w:p>
+            <w:pPr>
+              <w:jc w:val="center"/>
+              <w:textAlignment w:val="baseline"/>
+              <w:rPr>
+                <w:rFonts w:ascii="Times New Roman" w:eastAsia="Times New Roman" w:hAnsi="Times New Roman" w:cs="Times New Roman"/>
+                <w:kern w:val="0"/>
+                <w14:ligatures w14:val="none"/>
+              </w:rPr>
+            </w:pPr>
+            <w:r>
+              <w:rPr>
+                <w:rFonts w:ascii="Aptos" w:eastAsia="Times New Roman" w:hAnsi="Aptos" w:cs="Times New Roman"/>
+                <w:kern w:val="0"/>
+                <w14:ligatures w14:val="none"/>
+              </w:rPr>
+              <w:t xml:space="preserve">(Current) </w:t>
+            </w:r>
+            <w:r>
+              <w:rPr>
+                <w:rFonts w:ascii="Aptos" w:eastAsia="Times New Roman" w:hAnsi="Aptos" w:cs="Times New Roman"/>
+                <w:kern w:val="0"/>
+                <w14:ligatures w14:val="none"/>
+              </w:rPr>
+              <w:t>Medicaid Employee </w:t>
+            </w:r>
+          </w:p>
+        </w:tc>
+        <w:tc>
+          <w:tcPr>
+            <w:tcW w:w="3972" w:type="dxa"/>
+            <w:vAlign w:val="center"/>
+            <w:hideMark/>
+          </w:tcPr>
+          <w:p>
+            <w:pPr>
+              <w:jc w:val="center"/>
+              <w:textAlignment w:val="baseline"/>
+              <w:cnfStyle w:val="000000100000" w:firstRow="0" w:lastRow="0" w:firstColumn="0" w:lastColumn="0" w:oddVBand="0" w:evenVBand="0" w:oddHBand="1" w:evenHBand="0" w:firstRowFirstColumn="0" w:firstRowLastColumn="0" w:lastRowFirstColumn="0" w:lastRowLastColumn="0"/>
+              <w:rPr>
+                <w:rFonts w:ascii="Times New Roman" w:eastAsia="Times New Roman" w:hAnsi="Times New Roman" w:cs="Times New Roman"/>
+                <w:kern w:val="0"/>
+                <w14:ligatures w14:val="none"/>
+              </w:rPr>
+            </w:pPr>
+            <w:r>
+              <w:rPr>
+                <w:rFonts w:ascii="Aptos" w:eastAsia="Times New Roman" w:hAnsi="Aptos" w:cs="Times New Roman"/>
+                <w:kern w:val="0"/>
+                <w14:ligatures w14:val="none"/>
+              </w:rPr>
+              <w:t>As a Medicaid Employee, I want to view a recipient’s employment hours, employer information, and any other needed documentation in one place so that I can quickly verify whether the recipient meets the work requirement for Medicaid eligibility. </w:t>
+            </w:r>
+          </w:p>
+          <w:p>
+            <w:pPr>
+              <w:jc w:val="center"/>
+              <w:textAlignment w:val="baseline"/>
+              <w:cnfStyle w:val="000000100000" w:firstRow="0" w:lastRow="0" w:firstColumn="0" w:lastColumn="0" w:oddVBand="0" w:evenVBand="0" w:oddHBand="1" w:evenHBand="0" w:firstRowFirstColumn="0" w:firstRowLastColumn="0" w:lastRowFirstColumn="0" w:lastRowLastColumn="0"/>
+              <w:rPr>
+                <w:rFonts w:ascii="Times New Roman" w:eastAsia="Times New Roman" w:hAnsi="Times New Roman" w:cs="Times New Roman"/>
+                <w:kern w:val="0"/>
+                <w14:ligatures w14:val="none"/>
+              </w:rPr>
+            </w:pPr>
+            <w:r>
+              <w:rPr>
+                <w:rFonts w:ascii="Aptos" w:eastAsia="Times New Roman" w:hAnsi="Aptos" w:cs="Times New Roman"/>
+                <w:kern w:val="0"/>
+                <w14:ligatures w14:val="none"/>
+              </w:rPr>
+              <w:t> </w:t>
+            </w:r>
+          </w:p>
+        </w:tc>
+        <w:tc>
+          <w:tcPr>
+            <w:tcW w:w="1496" w:type="dxa"/>
+            <w:vAlign w:val="center"/>
+            <w:hideMark/>
+          </w:tcPr>
+          <w:p>
+            <w:pPr>
+              <w:jc w:val="center"/>
+              <w:textAlignment w:val="baseline"/>
+              <w:cnfStyle w:val="000000100000" w:firstRow="0" w:lastRow="0" w:firstColumn="0" w:lastColumn="0" w:oddVBand="0" w:evenVBand="0" w:oddHBand="1" w:evenHBand="0" w:firstRowFirstColumn="0" w:firstRowLastColumn="0" w:lastRowFirstColumn="0" w:lastRowLastColumn="0"/>
+              <w:rPr>
+                <w:rFonts w:ascii="Times New Roman" w:eastAsia="Times New Roman" w:hAnsi="Times New Roman" w:cs="Times New Roman"/>
+                <w:kern w:val="0"/>
+                <w14:ligatures w14:val="none"/>
+              </w:rPr>
+            </w:pPr>
+            <w:r>
+              <w:rPr>
+                <w:rFonts w:ascii="Aptos" w:eastAsia="Times New Roman" w:hAnsi="Aptos" w:cs="Times New Roman"/>
+                <w:kern w:val="0"/>
+                <w14:ligatures w14:val="none"/>
+              </w:rPr>
+              <w:t>High </w:t>
+            </w:r>
+          </w:p>
+        </w:tc>
+        <w:tc>
+          <w:tcPr>
+            <w:tcW w:w="1780" w:type="dxa"/>
+            <w:vAlign w:val="center"/>
+            <w:hideMark/>
+          </w:tcPr>
+          <w:p>
+            <w:pPr>
+              <w:jc w:val="center"/>
+              <w:textAlignment w:val="baseline"/>
+              <w:cnfStyle w:val="000000100000" w:firstRow="0" w:lastRow="0" w:firstColumn="0" w:lastColumn="0" w:oddVBand="0" w:evenVBand="0" w:oddHBand="1" w:evenHBand="0" w:firstRowFirstColumn="0" w:firstRowLastColumn="0" w:lastRowFirstColumn="0" w:lastRowLastColumn="0"/>
+              <w:rPr>
+                <w:rFonts w:ascii="Times New Roman" w:eastAsia="Times New Roman" w:hAnsi="Times New Roman" w:cs="Times New Roman"/>
+                <w:kern w:val="0"/>
+                <w14:ligatures w14:val="none"/>
+              </w:rPr>
+            </w:pPr>
+            <w:r>
+              <w:rPr>
+                <w:rFonts w:ascii="Aptos" w:eastAsia="Times New Roman" w:hAnsi="Aptos" w:cs="Times New Roman"/>
+                <w:kern w:val="0"/>
+                <w14:ligatures w14:val="none"/>
+              </w:rPr>
+              <w:t>2</w:t>
+            </w:r>
+            <w:r>
+              <w:rPr>
+                <w:rFonts w:ascii="Aptos" w:eastAsia="Times New Roman" w:hAnsi="Aptos" w:cs="Times New Roman"/>
+                <w:kern w:val="0"/>
+                <w14:ligatures w14:val="none"/>
+              </w:rPr>
+              <w:t xml:space="preserve"> sprints, </w:t>
+            </w:r>
+            <w:r>
+              <w:rPr>
+                <w:rFonts w:ascii="Aptos" w:eastAsia="Times New Roman" w:hAnsi="Aptos" w:cs="Times New Roman"/>
+                <w:kern w:val="0"/>
+                <w14:ligatures w14:val="none"/>
+              </w:rPr>
+              <w:t>2</w:t>
+            </w:r>
+            <w:r>
+              <w:rPr>
+                <w:rFonts w:ascii="Aptos" w:eastAsia="Times New Roman" w:hAnsi="Aptos" w:cs="Times New Roman"/>
+                <w:kern w:val="0"/>
+                <w14:ligatures w14:val="none"/>
+              </w:rPr>
+              <w:t xml:space="preserve"> people, </w:t>
+            </w:r>
+            <w:r>
+              <w:rPr>
+                <w:rFonts w:ascii="Aptos" w:eastAsia="Times New Roman" w:hAnsi="Aptos" w:cs="Times New Roman"/>
+                <w:kern w:val="0"/>
+                <w14:ligatures w14:val="none"/>
+              </w:rPr>
+              <w:t>2</w:t>
+            </w:r>
+            <w:r>
+              <w:rPr>
+                <w:rFonts w:ascii="Aptos" w:eastAsia="Times New Roman" w:hAnsi="Aptos" w:cs="Times New Roman"/>
+                <w:kern w:val="0"/>
+                <w14:ligatures w14:val="none"/>
+              </w:rPr>
+              <w:t>0 hours </w:t>
+            </w:r>
+          </w:p>
+        </w:tc>
+      </w:tr>
+      <w:tr>
+        <w:trPr>
+          <w:trHeight w:val="1440"/>
+          <w:jc w:val="center"/>
+        </w:trPr>
+        <w:tc>
+          <w:tcPr>
+            <w:cnfStyle w:val="001000000000" w:firstRow="0" w:lastRow="0" w:firstColumn="1" w:lastColumn="0" w:oddVBand="0" w:evenVBand="0" w:oddHBand="0" w:evenHBand="0" w:firstRowFirstColumn="0" w:firstRowLastColumn="0" w:lastRowFirstColumn="0" w:lastRowLastColumn="0"/>
+            <w:tcW w:w="2102" w:type="dxa"/>
+            <w:vAlign w:val="center"/>
+            <w:hideMark/>
+          </w:tcPr>
+          <w:p>
+            <w:pPr>
+              <w:jc w:val="center"/>
+              <w:textAlignment w:val="baseline"/>
+              <w:rPr>
+                <w:rFonts w:ascii="Times New Roman" w:eastAsia="Times New Roman" w:hAnsi="Times New Roman" w:cs="Times New Roman"/>
+                <w:kern w:val="0"/>
+                <w14:ligatures w14:val="none"/>
+              </w:rPr>
+            </w:pPr>
+            <w:r>
+              <w:rPr>
+                <w:rFonts w:ascii="Aptos" w:eastAsia="Times New Roman" w:hAnsi="Aptos" w:cs="Times New Roman"/>
+                <w:kern w:val="0"/>
+                <w14:ligatures w14:val="none"/>
+              </w:rPr>
+              <w:lastRenderedPageBreak/>
+              <w:t>Medicaid Applicant </w:t>
+            </w:r>
+          </w:p>
+        </w:tc>
+        <w:tc>
+          <w:tcPr>
+            <w:tcW w:w="3972" w:type="dxa"/>
+            <w:vAlign w:val="center"/>
+            <w:hideMark/>
+          </w:tcPr>
+          <w:p>
+            <w:pPr>
+              <w:jc w:val="center"/>
+              <w:textAlignment w:val="baseline"/>
+              <w:cnfStyle w:val="000000000000" w:firstRow="0" w:lastRow="0" w:firstColumn="0" w:lastColumn="0" w:oddVBand="0" w:evenVBand="0" w:oddHBand="0" w:evenHBand="0" w:firstRowFirstColumn="0" w:firstRowLastColumn="0" w:lastRowFirstColumn="0" w:lastRowLastColumn="0"/>
+              <w:rPr>
+                <w:rFonts w:ascii="Times New Roman" w:eastAsia="Times New Roman" w:hAnsi="Times New Roman" w:cs="Times New Roman"/>
+                <w:kern w:val="0"/>
+                <w14:ligatures w14:val="none"/>
+              </w:rPr>
+            </w:pPr>
+            <w:r>
+              <w:rPr>
+                <w:rFonts w:ascii="Aptos" w:eastAsia="Times New Roman" w:hAnsi="Aptos" w:cs="Times New Roman"/>
+                <w:kern w:val="0"/>
+                <w14:ligatures w14:val="none"/>
+              </w:rPr>
+              <w:t>As a Medicaid applicant, I want to be able to update my employment information if my job or income changes so that my eligibility can be reviewed using accurate information. </w:t>
+            </w:r>
+          </w:p>
+          <w:p>
+            <w:pPr>
+              <w:jc w:val="center"/>
+              <w:textAlignment w:val="baseline"/>
+              <w:cnfStyle w:val="000000000000" w:firstRow="0" w:lastRow="0" w:firstColumn="0" w:lastColumn="0" w:oddVBand="0" w:evenVBand="0" w:oddHBand="0" w:evenHBand="0" w:firstRowFirstColumn="0" w:firstRowLastColumn="0" w:lastRowFirstColumn="0" w:lastRowLastColumn="0"/>
+              <w:rPr>
+                <w:rFonts w:ascii="Times New Roman" w:eastAsia="Times New Roman" w:hAnsi="Times New Roman" w:cs="Times New Roman"/>
+                <w:kern w:val="0"/>
+                <w14:ligatures w14:val="none"/>
+              </w:rPr>
+            </w:pPr>
+            <w:r>
+              <w:rPr>
+                <w:rFonts w:ascii="Aptos" w:eastAsia="Times New Roman" w:hAnsi="Aptos" w:cs="Times New Roman"/>
+                <w:kern w:val="0"/>
+                <w14:ligatures w14:val="none"/>
+              </w:rPr>
+              <w:t> </w:t>
+            </w:r>
+          </w:p>
+        </w:tc>
+        <w:tc>
+          <w:tcPr>
+            <w:tcW w:w="1496" w:type="dxa"/>
+            <w:vAlign w:val="center"/>
+            <w:hideMark/>
+          </w:tcPr>
+          <w:p>
+            <w:pPr>
+              <w:jc w:val="center"/>
+              <w:textAlignment w:val="baseline"/>
+              <w:cnfStyle w:val="000000000000" w:firstRow="0" w:lastRow="0" w:firstColumn="0" w:lastColumn="0" w:oddVBand="0" w:evenVBand="0" w:oddHBand="0" w:evenHBand="0" w:firstRowFirstColumn="0" w:firstRowLastColumn="0" w:lastRowFirstColumn="0" w:lastRowLastColumn="0"/>
+              <w:rPr>
+                <w:rFonts w:ascii="Times New Roman" w:eastAsia="Times New Roman" w:hAnsi="Times New Roman" w:cs="Times New Roman"/>
+                <w:kern w:val="0"/>
+                <w14:ligatures w14:val="none"/>
+              </w:rPr>
+            </w:pPr>
+            <w:r>
+              <w:rPr>
+                <w:rFonts w:ascii="Aptos" w:eastAsia="Times New Roman" w:hAnsi="Aptos" w:cs="Times New Roman"/>
+                <w:kern w:val="0"/>
+                <w14:ligatures w14:val="none"/>
+              </w:rPr>
+              <w:t>Medium </w:t>
+            </w:r>
+          </w:p>
+        </w:tc>
+        <w:tc>
+          <w:tcPr>
+            <w:tcW w:w="1780" w:type="dxa"/>
+            <w:vAlign w:val="center"/>
+            <w:hideMark/>
+          </w:tcPr>
+          <w:p>
+            <w:pPr>
+              <w:jc w:val="center"/>
+              <w:textAlignment w:val="baseline"/>
+              <w:cnfStyle w:val="000000000000" w:firstRow="0" w:lastRow="0" w:firstColumn="0" w:lastColumn="0" w:oddVBand="0" w:evenVBand="0" w:oddHBand="0" w:evenHBand="0" w:firstRowFirstColumn="0" w:firstRowLastColumn="0" w:lastRowFirstColumn="0" w:lastRowLastColumn="0"/>
+              <w:rPr>
+                <w:rFonts w:ascii="Times New Roman" w:eastAsia="Times New Roman" w:hAnsi="Times New Roman" w:cs="Times New Roman"/>
+                <w:kern w:val="0"/>
+                <w14:ligatures w14:val="none"/>
+              </w:rPr>
+            </w:pPr>
+            <w:r>
+              <w:rPr>
+                <w:rFonts w:ascii="Aptos" w:eastAsia="Times New Roman" w:hAnsi="Aptos" w:cs="Times New Roman"/>
+                <w:kern w:val="0"/>
+                <w14:ligatures w14:val="none"/>
+              </w:rPr>
+              <w:t>2 sprint, 1 person, 8 hours </w:t>
+            </w:r>
+          </w:p>
+        </w:tc>
+      </w:tr>
+      <w:tr>
+        <w:trPr>
+          <w:cnfStyle w:val="000000100000" w:firstRow="0" w:lastRow="0" w:firstColumn="0" w:lastColumn="0" w:oddVBand="0" w:evenVBand="0" w:oddHBand="1" w:evenHBand="0" w:firstRowFirstColumn="0" w:firstRowLastColumn="0" w:lastRowFirstColumn="0" w:lastRowLastColumn="0"/>
+          <w:trHeight w:val="1440"/>
+          <w:jc w:val="center"/>
+        </w:trPr>
+        <w:tc>
+          <w:tcPr>
+            <w:cnfStyle w:val="001000000000" w:firstRow="0" w:lastRow="0" w:firstColumn="1" w:lastColumn="0" w:oddVBand="0" w:evenVBand="0" w:oddHBand="0" w:evenHBand="0" w:firstRowFirstColumn="0" w:firstRowLastColumn="0" w:lastRowFirstColumn="0" w:lastRowLastColumn="0"/>
+            <w:tcW w:w="2102" w:type="dxa"/>
+            <w:vAlign w:val="center"/>
+          </w:tcPr>
+          <w:p>
+            <w:pPr>
+              <w:jc w:val="center"/>
+              <w:textAlignment w:val="baseline"/>
+              <w:rPr>
+                <w:rFonts w:ascii="Aptos" w:eastAsia="Times New Roman" w:hAnsi="Aptos" w:cs="Times New Roman"/>
+              </w:rPr>
+            </w:pPr>
+            <w:r>
+              <w:rPr>
+                <w:rFonts w:ascii="Aptos" w:eastAsia="Times New Roman" w:hAnsi="Aptos" w:cs="Times New Roman"/>
+              </w:rPr>
+              <w:t xml:space="preserve">(Current) </w:t>
+            </w:r>
+            <w:r>
+              <w:rPr>
+                <w:rFonts w:ascii="Aptos" w:eastAsia="Times New Roman" w:hAnsi="Aptos" w:cs="Times New Roman"/>
+              </w:rPr>
+              <w:t>Medicaid Employee</w:t>
+            </w:r>
+          </w:p>
+        </w:tc>
+        <w:tc>
+          <w:tcPr>
+            <w:tcW w:w="3972" w:type="dxa"/>
+            <w:vAlign w:val="center"/>
+          </w:tcPr>
+          <w:p>
+            <w:pPr>
+              <w:jc w:val="center"/>
+              <w:textAlignment w:val="baseline"/>
+              <w:cnfStyle w:val="000000100000" w:firstRow="0" w:lastRow="0" w:firstColumn="0" w:lastColumn="0" w:oddVBand="0" w:evenVBand="0" w:oddHBand="1" w:evenHBand="0" w:firstRowFirstColumn="0" w:firstRowLastColumn="0" w:lastRowFirstColumn="0" w:lastRowLastColumn="0"/>
+              <w:rPr>
+                <w:rFonts w:ascii="Aptos" w:eastAsia="Times New Roman" w:hAnsi="Aptos" w:cs="Times New Roman"/>
+              </w:rPr>
+            </w:pPr>
+            <w:r>
+              <w:rPr>
+                <w:rFonts w:ascii="Aptos" w:eastAsia="Times New Roman" w:hAnsi="Aptos" w:cs="Times New Roman"/>
+              </w:rPr>
+              <w:t>As a Medicaid employee, I want to be able to notify an applicant if their provided documentation is not suitable to be used for verification.</w:t>
+            </w:r>
+          </w:p>
+        </w:tc>
+        <w:tc>
+          <w:tcPr>
+            <w:tcW w:w="1496" w:type="dxa"/>
+            <w:vAlign w:val="center"/>
+          </w:tcPr>
+          <w:p>
+            <w:pPr>
+              <w:jc w:val="center"/>
+              <w:textAlignment w:val="baseline"/>
+              <w:cnfStyle w:val="000000100000" w:firstRow="0" w:lastRow="0" w:firstColumn="0" w:lastColumn="0" w:oddVBand="0" w:evenVBand="0" w:oddHBand="1" w:evenHBand="0" w:firstRowFirstColumn="0" w:firstRowLastColumn="0" w:lastRowFirstColumn="0" w:lastRowLastColumn="0"/>
+              <w:rPr>
+                <w:rFonts w:ascii="Aptos" w:eastAsia="Times New Roman" w:hAnsi="Aptos" w:cs="Times New Roman"/>
+              </w:rPr>
+            </w:pPr>
+            <w:r>
+              <w:rPr>
+                <w:rFonts w:ascii="Aptos" w:eastAsia="Times New Roman" w:hAnsi="Aptos" w:cs="Times New Roman"/>
+              </w:rPr>
+              <w:t>Medium</w:t>
+            </w:r>
+          </w:p>
+        </w:tc>
+        <w:tc>
+          <w:tcPr>
+            <w:tcW w:w="1780" w:type="dxa"/>
+            <w:vAlign w:val="center"/>
+          </w:tcPr>
+          <w:p>
+            <w:pPr>
+              <w:jc w:val="center"/>
+              <w:textAlignment w:val="baseline"/>
+              <w:cnfStyle w:val="000000100000" w:firstRow="0" w:lastRow="0" w:firstColumn="0" w:lastColumn="0" w:oddVBand="0" w:evenVBand="0" w:oddHBand="1" w:evenHBand="0" w:firstRowFirstColumn="0" w:firstRowLastColumn="0" w:lastRowFirstColumn="0" w:lastRowLastColumn="0"/>
+              <w:rPr>
+                <w:rFonts w:ascii="Aptos" w:eastAsia="Times New Roman" w:hAnsi="Aptos" w:cs="Times New Roman"/>
+              </w:rPr>
+            </w:pPr>
+            <w:r>
+              <w:rPr>
+                <w:rFonts w:ascii="Aptos" w:eastAsia="Times New Roman" w:hAnsi="Aptos" w:cs="Times New Roman"/>
+              </w:rPr>
+              <w:t>1 sprint, 1 person, 5 hours</w:t>
+            </w:r>
+          </w:p>
+        </w:tc>
+      </w:tr>
+      <w:tr>
+        <w:trPr>
+          <w:trHeight w:val="1440"/>
+          <w:jc w:val="center"/>
+        </w:trPr>
+        <w:tc>
+          <w:tcPr>
+            <w:cnfStyle w:val="001000000000" w:firstRow="0" w:lastRow="0" w:firstColumn="1" w:lastColumn="0" w:oddVBand="0" w:evenVBand="0" w:oddHBand="0" w:evenHBand="0" w:firstRowFirstColumn="0" w:firstRowLastColumn="0" w:lastRowFirstColumn="0" w:lastRowLastColumn="0"/>
+            <w:tcW w:w="2102" w:type="dxa"/>
+            <w:vAlign w:val="center"/>
+          </w:tcPr>
+          <w:p>
+            <w:pPr>
+              <w:jc w:val="center"/>
+              <w:textAlignment w:val="baseline"/>
+              <w:rPr>
+                <w:rFonts w:ascii="Aptos" w:eastAsia="Times New Roman" w:hAnsi="Aptos" w:cs="Times New Roman"/>
+              </w:rPr>
+            </w:pPr>
+            <w:r>
+              <w:rPr>
+                <w:rFonts w:ascii="Aptos" w:eastAsia="Times New Roman" w:hAnsi="Aptos" w:cs="Times New Roman"/>
+              </w:rPr>
+              <w:t>Medicaid Applicant</w:t>
+            </w:r>
+          </w:p>
+        </w:tc>
+        <w:tc>
+          <w:tcPr>
+            <w:tcW w:w="3972" w:type="dxa"/>
+            <w:vAlign w:val="center"/>
+          </w:tcPr>
+          <w:p>
+            <w:pPr>
+              <w:jc w:val="center"/>
+              <w:textAlignment w:val="baseline"/>
+              <w:cnfStyle w:val="000000000000" w:firstRow="0" w:lastRow="0" w:firstColumn="0" w:lastColumn="0" w:oddVBand="0" w:evenVBand="0" w:oddHBand="0" w:evenHBand="0" w:firstRowFirstColumn="0" w:firstRowLastColumn="0" w:lastRowFirstColumn="0" w:lastRowLastColumn="0"/>
+              <w:rPr>
+                <w:rFonts w:ascii="Aptos" w:eastAsia="Times New Roman" w:hAnsi="Aptos" w:cs="Times New Roman"/>
+              </w:rPr>
+            </w:pPr>
+            <w:r>
+              <w:rPr>
+                <w:rFonts w:ascii="Aptos" w:eastAsia="Times New Roman" w:hAnsi="Aptos" w:cs="Times New Roman"/>
+              </w:rPr>
+              <w:t xml:space="preserve">As a Medicaid Applicant, I want to be able to upload additional documentation if the person </w:t>
+            </w:r>
+            <w:proofErr w:type="gramStart"/>
+            <w:r>
+              <w:rPr>
+                <w:rFonts w:ascii="Aptos" w:eastAsia="Times New Roman" w:hAnsi="Aptos" w:cs="Times New Roman"/>
+              </w:rPr>
+              <w:t>reviewing</w:t>
+            </w:r>
+            <w:proofErr w:type="gramEnd"/>
+            <w:r>
+              <w:rPr>
+                <w:rFonts w:ascii="Aptos" w:eastAsia="Times New Roman" w:hAnsi="Aptos" w:cs="Times New Roman"/>
+              </w:rPr>
+              <w:t xml:space="preserve"> my application requests it.</w:t>
+            </w:r>
+          </w:p>
+        </w:tc>
+        <w:tc>
+          <w:tcPr>
+            <w:tcW w:w="1496" w:type="dxa"/>
+            <w:vAlign w:val="center"/>
+          </w:tcPr>
+          <w:p>
+            <w:pPr>
+              <w:jc w:val="center"/>
+              <w:textAlignment w:val="baseline"/>
+              <w:cnfStyle w:val="000000000000" w:firstRow="0" w:lastRow="0" w:firstColumn="0" w:lastColumn="0" w:oddVBand="0" w:evenVBand="0" w:oddHBand="0" w:evenHBand="0" w:firstRowFirstColumn="0" w:firstRowLastColumn="0" w:lastRowFirstColumn="0" w:lastRowLastColumn="0"/>
+              <w:rPr>
+                <w:rFonts w:ascii="Aptos" w:eastAsia="Times New Roman" w:hAnsi="Aptos" w:cs="Times New Roman"/>
+              </w:rPr>
+            </w:pPr>
+            <w:r>
+              <w:rPr>
+                <w:rFonts w:ascii="Aptos" w:eastAsia="Times New Roman" w:hAnsi="Aptos" w:cs="Times New Roman"/>
+              </w:rPr>
+              <w:t>Medium</w:t>
+            </w:r>
+          </w:p>
+        </w:tc>
+        <w:tc>
+          <w:tcPr>
+            <w:tcW w:w="1780" w:type="dxa"/>
+            <w:vAlign w:val="center"/>
+          </w:tcPr>
+          <w:p>
+            <w:pPr>
+              <w:jc w:val="center"/>
+              <w:textAlignment w:val="baseline"/>
+              <w:cnfStyle w:val="000000000000" w:firstRow="0" w:lastRow="0" w:firstColumn="0" w:lastColumn="0" w:oddVBand="0" w:evenVBand="0" w:oddHBand="0" w:evenHBand="0" w:firstRowFirstColumn="0" w:firstRowLastColumn="0" w:lastRowFirstColumn="0" w:lastRowLastColumn="0"/>
+              <w:rPr>
+                <w:rFonts w:ascii="Aptos" w:eastAsia="Times New Roman" w:hAnsi="Aptos" w:cs="Times New Roman"/>
+              </w:rPr>
+            </w:pPr>
+            <w:r>
+              <w:rPr>
+                <w:rFonts w:ascii="Aptos" w:eastAsia="Times New Roman" w:hAnsi="Aptos" w:cs="Times New Roman"/>
+              </w:rPr>
+              <w:t>1 spring, 1 person, 5 hours</w:t>
+            </w:r>
+          </w:p>
+        </w:tc>
+      </w:tr>
+      <w:tr>
+        <w:trPr>
+          <w:cnfStyle w:val="000000100000" w:firstRow="0" w:lastRow="0" w:firstColumn="0" w:lastColumn="0" w:oddVBand="0" w:evenVBand="0" w:oddHBand="1" w:evenHBand="0" w:firstRowFirstColumn="0" w:firstRowLastColumn="0" w:lastRowFirstColumn="0" w:lastRowLastColumn="0"/>
+          <w:trHeight w:val="1440"/>
+          <w:jc w:val="center"/>
+        </w:trPr>
+        <w:tc>
+          <w:tcPr>
+            <w:cnfStyle w:val="001000000000" w:firstRow="0" w:lastRow="0" w:firstColumn="1" w:lastColumn="0" w:oddVBand="0" w:evenVBand="0" w:oddHBand="0" w:evenHBand="0" w:firstRowFirstColumn="0" w:firstRowLastColumn="0" w:lastRowFirstColumn="0" w:lastRowLastColumn="0"/>
+            <w:tcW w:w="2102" w:type="dxa"/>
+            <w:vAlign w:val="center"/>
+            <w:hideMark/>
+          </w:tcPr>
+          <w:p>
+            <w:pPr>
+              <w:jc w:val="center"/>
+              <w:textAlignment w:val="baseline"/>
+              <w:rPr>
+                <w:rFonts w:ascii="Times New Roman" w:eastAsia="Times New Roman" w:hAnsi="Times New Roman" w:cs="Times New Roman"/>
+                <w:kern w:val="0"/>
+                <w14:ligatures w14:val="none"/>
+              </w:rPr>
+            </w:pPr>
+            <w:r>
+              <w:rPr>
+                <w:rFonts w:ascii="Aptos" w:eastAsia="Times New Roman" w:hAnsi="Aptos" w:cs="Times New Roman"/>
+                <w:kern w:val="0"/>
+                <w14:ligatures w14:val="none"/>
+              </w:rPr>
+              <w:t>Caregiver Of Medicaid Applicant </w:t>
+            </w:r>
+          </w:p>
+        </w:tc>
+        <w:tc>
+          <w:tcPr>
+            <w:tcW w:w="3972" w:type="dxa"/>
+            <w:vAlign w:val="center"/>
+            <w:hideMark/>
+          </w:tcPr>
+          <w:p>
+            <w:pPr>
+              <w:jc w:val="center"/>
+              <w:textAlignment w:val="baseline"/>
+              <w:cnfStyle w:val="000000100000" w:firstRow="0" w:lastRow="0" w:firstColumn="0" w:lastColumn="0" w:oddVBand="0" w:evenVBand="0" w:oddHBand="1" w:evenHBand="0" w:firstRowFirstColumn="0" w:firstRowLastColumn="0" w:lastRowFirstColumn="0" w:lastRowLastColumn="0"/>
+              <w:rPr>
+                <w:rFonts w:ascii="Times New Roman" w:eastAsia="Times New Roman" w:hAnsi="Times New Roman" w:cs="Times New Roman"/>
+                <w:kern w:val="0"/>
+                <w14:ligatures w14:val="none"/>
+              </w:rPr>
+            </w:pPr>
+            <w:r>
+              <w:rPr>
+                <w:rFonts w:ascii="Aptos" w:eastAsia="Times New Roman" w:hAnsi="Aptos" w:cs="Times New Roman"/>
+                <w:kern w:val="0"/>
+                <w14:ligatures w14:val="none"/>
+              </w:rPr>
+              <w:t>As a caretaker of a parent on Medicaid, I want to be able to submit employment verification easily and reliably so I can be confident knowing my parent will continue to receive coverage </w:t>
+            </w:r>
+          </w:p>
+        </w:tc>
+        <w:tc>
+          <w:tcPr>
+            <w:tcW w:w="1496" w:type="dxa"/>
+            <w:vAlign w:val="center"/>
+            <w:hideMark/>
+          </w:tcPr>
+          <w:p>
+            <w:pPr>
+              <w:jc w:val="center"/>
+              <w:textAlignment w:val="baseline"/>
+              <w:cnfStyle w:val="000000100000" w:firstRow="0" w:lastRow="0" w:firstColumn="0" w:lastColumn="0" w:oddVBand="0" w:evenVBand="0" w:oddHBand="1" w:evenHBand="0" w:firstRowFirstColumn="0" w:firstRowLastColumn="0" w:lastRowFirstColumn="0" w:lastRowLastColumn="0"/>
+              <w:rPr>
+                <w:rFonts w:ascii="Times New Roman" w:eastAsia="Times New Roman" w:hAnsi="Times New Roman" w:cs="Times New Roman"/>
+                <w:kern w:val="0"/>
+                <w14:ligatures w14:val="none"/>
+              </w:rPr>
+            </w:pPr>
+            <w:r>
+              <w:rPr>
+                <w:rFonts w:ascii="Aptos" w:eastAsia="Times New Roman" w:hAnsi="Aptos" w:cs="Times New Roman"/>
+                <w:kern w:val="0"/>
+                <w14:ligatures w14:val="none"/>
+              </w:rPr>
+              <w:t>Medium </w:t>
+            </w:r>
+          </w:p>
+        </w:tc>
+        <w:tc>
+          <w:tcPr>
+            <w:tcW w:w="1780" w:type="dxa"/>
+            <w:vAlign w:val="center"/>
+            <w:hideMark/>
+          </w:tcPr>
+          <w:p>
+            <w:pPr>
+              <w:jc w:val="center"/>
+              <w:textAlignment w:val="baseline"/>
+              <w:cnfStyle w:val="000000100000" w:firstRow="0" w:lastRow="0" w:firstColumn="0" w:lastColumn="0" w:oddVBand="0" w:evenVBand="0" w:oddHBand="1" w:evenHBand="0" w:firstRowFirstColumn="0" w:firstRowLastColumn="0" w:lastRowFirstColumn="0" w:lastRowLastColumn="0"/>
+              <w:rPr>
+                <w:rFonts w:ascii="Times New Roman" w:eastAsia="Times New Roman" w:hAnsi="Times New Roman" w:cs="Times New Roman"/>
+                <w:kern w:val="0"/>
+                <w14:ligatures w14:val="none"/>
+              </w:rPr>
+            </w:pPr>
+            <w:r>
+              <w:rPr>
+                <w:rFonts w:ascii="Aptos" w:eastAsia="Times New Roman" w:hAnsi="Aptos" w:cs="Times New Roman"/>
+                <w:kern w:val="0"/>
+                <w14:ligatures w14:val="none"/>
+              </w:rPr>
+              <w:t>2</w:t>
+            </w:r>
+            <w:r>
+              <w:rPr>
+                <w:rFonts w:ascii="Aptos" w:eastAsia="Times New Roman" w:hAnsi="Aptos" w:cs="Times New Roman"/>
+                <w:kern w:val="0"/>
+                <w14:ligatures w14:val="none"/>
+              </w:rPr>
+              <w:t xml:space="preserve"> </w:t>
+            </w:r>
+            <w:proofErr w:type="gramStart"/>
+            <w:r>
+              <w:rPr>
+                <w:rFonts w:ascii="Aptos" w:eastAsia="Times New Roman" w:hAnsi="Aptos" w:cs="Times New Roman"/>
+                <w:kern w:val="0"/>
+                <w14:ligatures w14:val="none"/>
+              </w:rPr>
+              <w:t>sprint</w:t>
+            </w:r>
+            <w:proofErr w:type="gramEnd"/>
+            <w:r>
+              <w:rPr>
+                <w:rFonts w:ascii="Aptos" w:eastAsia="Times New Roman" w:hAnsi="Aptos" w:cs="Times New Roman"/>
+                <w:kern w:val="0"/>
+                <w14:ligatures w14:val="none"/>
+              </w:rPr>
+              <w:t>, 2 people, 12 hours </w:t>
+            </w:r>
+          </w:p>
+        </w:tc>
+      </w:tr>
+      <w:tr>
+        <w:trPr>
+          <w:trHeight w:val="1440"/>
+          <w:jc w:val="center"/>
+        </w:trPr>
+        <w:tc>
+          <w:tcPr>
+            <w:cnfStyle w:val="001000000000" w:firstRow="0" w:lastRow="0" w:firstColumn="1" w:lastColumn="0" w:oddVBand="0" w:evenVBand="0" w:oddHBand="0" w:evenHBand="0" w:firstRowFirstColumn="0" w:firstRowLastColumn="0" w:lastRowFirstColumn="0" w:lastRowLastColumn="0"/>
+            <w:tcW w:w="2102" w:type="dxa"/>
+            <w:vAlign w:val="center"/>
+            <w:hideMark/>
+          </w:tcPr>
+          <w:p>
+            <w:pPr>
+              <w:jc w:val="center"/>
+              <w:textAlignment w:val="baseline"/>
+              <w:rPr>
+                <w:rFonts w:ascii="Times New Roman" w:eastAsia="Times New Roman" w:hAnsi="Times New Roman" w:cs="Times New Roman"/>
+                <w:kern w:val="0"/>
+                <w14:ligatures w14:val="none"/>
+              </w:rPr>
+            </w:pPr>
+            <w:r>
+              <w:rPr>
+                <w:rFonts w:ascii="Aptos" w:eastAsia="Times New Roman" w:hAnsi="Aptos" w:cs="Times New Roman"/>
+                <w:kern w:val="0"/>
+                <w14:ligatures w14:val="none"/>
+              </w:rPr>
+              <w:t xml:space="preserve">(Current) </w:t>
+            </w:r>
+            <w:r>
+              <w:rPr>
+                <w:rFonts w:ascii="Aptos" w:eastAsia="Times New Roman" w:hAnsi="Aptos" w:cs="Times New Roman"/>
+                <w:kern w:val="0"/>
+                <w14:ligatures w14:val="none"/>
+              </w:rPr>
+              <w:t>Medicaid Applicant </w:t>
+            </w:r>
+          </w:p>
+        </w:tc>
+        <w:tc>
+          <w:tcPr>
+            <w:tcW w:w="3972" w:type="dxa"/>
+            <w:vAlign w:val="center"/>
+            <w:hideMark/>
+          </w:tcPr>
+          <w:p>
+            <w:pPr>
+              <w:jc w:val="center"/>
+              <w:textAlignment w:val="baseline"/>
+              <w:cnfStyle w:val="000000000000" w:firstRow="0" w:lastRow="0" w:firstColumn="0" w:lastColumn="0" w:oddVBand="0" w:evenVBand="0" w:oddHBand="0" w:evenHBand="0" w:firstRowFirstColumn="0" w:firstRowLastColumn="0" w:lastRowFirstColumn="0" w:lastRowLastColumn="0"/>
+              <w:rPr>
+                <w:rFonts w:ascii="Times New Roman" w:eastAsia="Times New Roman" w:hAnsi="Times New Roman" w:cs="Times New Roman"/>
+                <w:kern w:val="0"/>
+                <w14:ligatures w14:val="none"/>
+              </w:rPr>
+            </w:pPr>
+            <w:r>
+              <w:rPr>
+                <w:rFonts w:ascii="Aptos" w:eastAsia="Times New Roman" w:hAnsi="Aptos" w:cs="Times New Roman"/>
+                <w:kern w:val="0"/>
+                <w14:ligatures w14:val="none"/>
+              </w:rPr>
+              <w:t>As a Medicaid recipient, I want to be able to see the status of my submitted verification documents so that I can know whether my information has been accepted or if I need to provide something else. </w:t>
+            </w:r>
+          </w:p>
+        </w:tc>
+        <w:tc>
+          <w:tcPr>
+            <w:tcW w:w="1496" w:type="dxa"/>
+            <w:vAlign w:val="center"/>
+            <w:hideMark/>
+          </w:tcPr>
+          <w:p>
+            <w:pPr>
+              <w:jc w:val="center"/>
+              <w:textAlignment w:val="baseline"/>
+              <w:cnfStyle w:val="000000000000" w:firstRow="0" w:lastRow="0" w:firstColumn="0" w:lastColumn="0" w:oddVBand="0" w:evenVBand="0" w:oddHBand="0" w:evenHBand="0" w:firstRowFirstColumn="0" w:firstRowLastColumn="0" w:lastRowFirstColumn="0" w:lastRowLastColumn="0"/>
+              <w:rPr>
+                <w:rFonts w:ascii="Times New Roman" w:eastAsia="Times New Roman" w:hAnsi="Times New Roman" w:cs="Times New Roman"/>
+                <w:kern w:val="0"/>
+                <w14:ligatures w14:val="none"/>
+              </w:rPr>
+            </w:pPr>
+            <w:r>
+              <w:rPr>
+                <w:rFonts w:ascii="Aptos" w:eastAsia="Times New Roman" w:hAnsi="Aptos" w:cs="Times New Roman"/>
+                <w:kern w:val="0"/>
+                <w14:ligatures w14:val="none"/>
+              </w:rPr>
+              <w:t>High </w:t>
+            </w:r>
+          </w:p>
+        </w:tc>
+        <w:tc>
+          <w:tcPr>
+            <w:tcW w:w="1780" w:type="dxa"/>
+            <w:vAlign w:val="center"/>
+            <w:hideMark/>
+          </w:tcPr>
+          <w:p>
+            <w:pPr>
+              <w:jc w:val="center"/>
+              <w:textAlignment w:val="baseline"/>
+              <w:cnfStyle w:val="000000000000" w:firstRow="0" w:lastRow="0" w:firstColumn="0" w:lastColumn="0" w:oddVBand="0" w:evenVBand="0" w:oddHBand="0" w:evenHBand="0" w:firstRowFirstColumn="0" w:firstRowLastColumn="0" w:lastRowFirstColumn="0" w:lastRowLastColumn="0"/>
+              <w:rPr>
+                <w:rFonts w:ascii="Times New Roman" w:eastAsia="Times New Roman" w:hAnsi="Times New Roman" w:cs="Times New Roman"/>
+                <w:kern w:val="0"/>
+                <w14:ligatures w14:val="none"/>
+              </w:rPr>
+            </w:pPr>
+            <w:r>
+              <w:rPr>
+                <w:rFonts w:ascii="Aptos" w:eastAsia="Times New Roman" w:hAnsi="Aptos" w:cs="Times New Roman"/>
+                <w:kern w:val="0"/>
+                <w14:ligatures w14:val="none"/>
+              </w:rPr>
+              <w:t>2 sprint, 1 person, 12 hours </w:t>
+            </w:r>
+          </w:p>
+        </w:tc>
+      </w:tr>
+      <w:tr>
+        <w:trPr>
+          <w:cnfStyle w:val="000000100000" w:firstRow="0" w:lastRow="0" w:firstColumn="0" w:lastColumn="0" w:oddVBand="0" w:evenVBand="0" w:oddHBand="1" w:evenHBand="0" w:firstRowFirstColumn="0" w:firstRowLastColumn="0" w:lastRowFirstColumn="0" w:lastRowLastColumn="0"/>
+          <w:trHeight w:val="1440"/>
+          <w:jc w:val="center"/>
+        </w:trPr>
+        <w:tc>
+          <w:tcPr>
+            <w:cnfStyle w:val="001000000000" w:firstRow="0" w:lastRow="0" w:firstColumn="1" w:lastColumn="0" w:oddVBand="0" w:evenVBand="0" w:oddHBand="0" w:evenHBand="0" w:firstRowFirstColumn="0" w:firstRowLastColumn="0" w:lastRowFirstColumn="0" w:lastRowLastColumn="0"/>
+            <w:tcW w:w="2102" w:type="dxa"/>
+            <w:vAlign w:val="center"/>
+            <w:hideMark/>
+          </w:tcPr>
+          <w:p>
+            <w:pPr>
+              <w:jc w:val="center"/>
+              <w:textAlignment w:val="baseline"/>
+              <w:rPr>
+                <w:rFonts w:ascii="Times New Roman" w:eastAsia="Times New Roman" w:hAnsi="Times New Roman" w:cs="Times New Roman"/>
+                <w:kern w:val="0"/>
+                <w14:ligatures w14:val="none"/>
+              </w:rPr>
+            </w:pPr>
+            <w:r>
+              <w:rPr>
+                <w:rFonts w:ascii="Aptos" w:eastAsia="Times New Roman" w:hAnsi="Aptos" w:cs="Times New Roman"/>
+                <w:kern w:val="0"/>
+                <w14:ligatures w14:val="none"/>
+              </w:rPr>
+              <w:t xml:space="preserve">(Complete) </w:t>
+            </w:r>
+            <w:r>
+              <w:rPr>
+                <w:rFonts w:ascii="Aptos" w:eastAsia="Times New Roman" w:hAnsi="Aptos" w:cs="Times New Roman"/>
+                <w:kern w:val="0"/>
+                <w14:ligatures w14:val="none"/>
+              </w:rPr>
+              <w:t>Medicaid Applicant </w:t>
+            </w:r>
+          </w:p>
+        </w:tc>
+        <w:tc>
+          <w:tcPr>
+            <w:tcW w:w="3972" w:type="dxa"/>
+            <w:vAlign w:val="center"/>
+            <w:hideMark/>
+          </w:tcPr>
+          <w:p>
+            <w:pPr>
+              <w:jc w:val="center"/>
+              <w:textAlignment w:val="baseline"/>
+              <w:cnfStyle w:val="000000100000" w:firstRow="0" w:lastRow="0" w:firstColumn="0" w:lastColumn="0" w:oddVBand="0" w:evenVBand="0" w:oddHBand="1" w:evenHBand="0" w:firstRowFirstColumn="0" w:firstRowLastColumn="0" w:lastRowFirstColumn="0" w:lastRowLastColumn="0"/>
+              <w:rPr>
+                <w:rFonts w:ascii="Times New Roman" w:eastAsia="Times New Roman" w:hAnsi="Times New Roman" w:cs="Times New Roman"/>
+                <w:kern w:val="0"/>
+                <w14:ligatures w14:val="none"/>
+              </w:rPr>
+            </w:pPr>
+            <w:r>
+              <w:rPr>
+                <w:rFonts w:ascii="Aptos" w:eastAsia="Times New Roman" w:hAnsi="Aptos" w:cs="Times New Roman"/>
+                <w:kern w:val="0"/>
+                <w14:ligatures w14:val="none"/>
+              </w:rPr>
+              <w:t>As a Medicaid Applicant, I want to be able to upload documentation for any verification I need to provide during the application process</w:t>
+            </w:r>
+            <w:r>
+              <w:rPr>
+                <w:rFonts w:ascii="Aptos" w:eastAsia="Times New Roman" w:hAnsi="Aptos" w:cs="Times New Roman"/>
+                <w:kern w:val="0"/>
+                <w14:ligatures w14:val="none"/>
+              </w:rPr>
+              <w:t>.</w:t>
+            </w:r>
+            <w:r>
+              <w:rPr>
+                <w:rFonts w:ascii="Aptos" w:eastAsia="Times New Roman" w:hAnsi="Aptos" w:cs="Times New Roman"/>
+                <w:kern w:val="0"/>
+                <w14:ligatures w14:val="none"/>
+              </w:rPr>
+              <w:t> </w:t>
+            </w:r>
+          </w:p>
+        </w:tc>
+        <w:tc>
+          <w:tcPr>
+            <w:tcW w:w="1496" w:type="dxa"/>
+            <w:vAlign w:val="center"/>
+            <w:hideMark/>
+          </w:tcPr>
+          <w:p>
+            <w:pPr>
+              <w:jc w:val="center"/>
+              <w:textAlignment w:val="baseline"/>
+              <w:cnfStyle w:val="000000100000" w:firstRow="0" w:lastRow="0" w:firstColumn="0" w:lastColumn="0" w:oddVBand="0" w:evenVBand="0" w:oddHBand="1" w:evenHBand="0" w:firstRowFirstColumn="0" w:firstRowLastColumn="0" w:lastRowFirstColumn="0" w:lastRowLastColumn="0"/>
+              <w:rPr>
+                <w:rFonts w:ascii="Times New Roman" w:eastAsia="Times New Roman" w:hAnsi="Times New Roman" w:cs="Times New Roman"/>
+                <w:kern w:val="0"/>
+                <w14:ligatures w14:val="none"/>
+              </w:rPr>
+            </w:pPr>
+            <w:r>
+              <w:rPr>
+                <w:rFonts w:ascii="Aptos" w:eastAsia="Times New Roman" w:hAnsi="Aptos" w:cs="Times New Roman"/>
+                <w:kern w:val="0"/>
+                <w14:ligatures w14:val="none"/>
+              </w:rPr>
+              <w:t>High </w:t>
+            </w:r>
+          </w:p>
+        </w:tc>
+        <w:tc>
+          <w:tcPr>
+            <w:tcW w:w="1780" w:type="dxa"/>
+            <w:vAlign w:val="center"/>
+            <w:hideMark/>
+          </w:tcPr>
+          <w:p>
+            <w:pPr>
+              <w:jc w:val="center"/>
+              <w:textAlignment w:val="baseline"/>
+              <w:cnfStyle w:val="000000100000" w:firstRow="0" w:lastRow="0" w:firstColumn="0" w:lastColumn="0" w:oddVBand="0" w:evenVBand="0" w:oddHBand="1" w:evenHBand="0" w:firstRowFirstColumn="0" w:firstRowLastColumn="0" w:lastRowFirstColumn="0" w:lastRowLastColumn="0"/>
+              <w:rPr>
+                <w:rFonts w:ascii="Times New Roman" w:eastAsia="Times New Roman" w:hAnsi="Times New Roman" w:cs="Times New Roman"/>
+                <w:kern w:val="0"/>
+                <w14:ligatures w14:val="none"/>
+              </w:rPr>
+            </w:pPr>
+            <w:r>
+              <w:rPr>
+                <w:rFonts w:ascii="Aptos" w:eastAsia="Times New Roman" w:hAnsi="Aptos" w:cs="Times New Roman"/>
+                <w:kern w:val="0"/>
+                <w14:ligatures w14:val="none"/>
+              </w:rPr>
+              <w:t>2 sprint, 1 person, 8 hours </w:t>
+            </w:r>
+          </w:p>
+        </w:tc>
+      </w:tr>
+      <w:tr>
+        <w:trPr>
+          <w:trHeight w:val="1440"/>
+          <w:jc w:val="center"/>
+        </w:trPr>
+        <w:tc>
+          <w:tcPr>
+            <w:cnfStyle w:val="001000000000" w:firstRow="0" w:lastRow="0" w:firstColumn="1" w:lastColumn="0" w:oddVBand="0" w:evenVBand="0" w:oddHBand="0" w:evenHBand="0" w:firstRowFirstColumn="0" w:firstRowLastColumn="0" w:lastRowFirstColumn="0" w:lastRowLastColumn="0"/>
+            <w:tcW w:w="2102" w:type="dxa"/>
+            <w:vAlign w:val="center"/>
+          </w:tcPr>
+          <w:p>
+            <w:pPr>
+              <w:jc w:val="center"/>
+              <w:textAlignment w:val="baseline"/>
+              <w:rPr>
+                <w:rFonts w:ascii="Aptos" w:eastAsia="Times New Roman" w:hAnsi="Aptos" w:cs="Times New Roman"/>
+                <w:b w:val="0"/>
+                <w:bCs w:val="0"/>
+              </w:rPr>
+            </w:pPr>
+            <w:r>
+              <w:rPr>
+                <w:rFonts w:ascii="Aptos" w:eastAsia="Times New Roman" w:hAnsi="Aptos" w:cs="Times New Roman"/>
+              </w:rPr>
+              <w:t>(Current)</w:t>
+            </w:r>
+          </w:p>
+          <w:p>
+            <w:pPr>
+              <w:jc w:val="center"/>
+              <w:textAlignment w:val="baseline"/>
+              <w:rPr>
+                <w:rFonts w:ascii="Aptos" w:eastAsia="Times New Roman" w:hAnsi="Aptos" w:cs="Times New Roman"/>
+              </w:rPr>
+            </w:pPr>
+            <w:r>
+              <w:rPr>
+                <w:rFonts w:ascii="Aptos" w:eastAsia="Times New Roman" w:hAnsi="Aptos" w:cs="Times New Roman"/>
+              </w:rPr>
+              <w:t>Software Developer</w:t>
+            </w:r>
+          </w:p>
+        </w:tc>
+        <w:tc>
+          <w:tcPr>
+            <w:tcW w:w="3972" w:type="dxa"/>
+            <w:vAlign w:val="center"/>
+          </w:tcPr>
+          <w:p>
+            <w:pPr>
+              <w:jc w:val="center"/>
+              <w:textAlignment w:val="baseline"/>
+              <w:cnfStyle w:val="000000000000" w:firstRow="0" w:lastRow="0" w:firstColumn="0" w:lastColumn="0" w:oddVBand="0" w:evenVBand="0" w:oddHBand="0" w:evenHBand="0" w:firstRowFirstColumn="0" w:firstRowLastColumn="0" w:lastRowFirstColumn="0" w:lastRowLastColumn="0"/>
+              <w:rPr>
+                <w:rFonts w:ascii="Aptos" w:eastAsia="Times New Roman" w:hAnsi="Aptos" w:cs="Times New Roman"/>
+              </w:rPr>
+            </w:pPr>
+            <w:r>
+              <w:rPr>
+                <w:rFonts w:ascii="Aptos" w:eastAsia="Times New Roman" w:hAnsi="Aptos" w:cs="Times New Roman"/>
+              </w:rPr>
+              <w:t>As a software developer on this project, I want to get the MEVA web app to a state where it can be tested by non-developers.</w:t>
+            </w:r>
+          </w:p>
+        </w:tc>
+        <w:tc>
+          <w:tcPr>
+            <w:tcW w:w="1496" w:type="dxa"/>
+            <w:vAlign w:val="center"/>
+          </w:tcPr>
+          <w:p>
+            <w:pPr>
+              <w:jc w:val="center"/>
+              <w:textAlignment w:val="baseline"/>
+              <w:cnfStyle w:val="000000000000" w:firstRow="0" w:lastRow="0" w:firstColumn="0" w:lastColumn="0" w:oddVBand="0" w:evenVBand="0" w:oddHBand="0" w:evenHBand="0" w:firstRowFirstColumn="0" w:firstRowLastColumn="0" w:lastRowFirstColumn="0" w:lastRowLastColumn="0"/>
+              <w:rPr>
+                <w:rFonts w:ascii="Aptos" w:eastAsia="Times New Roman" w:hAnsi="Aptos" w:cs="Times New Roman"/>
+              </w:rPr>
+            </w:pPr>
+            <w:r>
+              <w:rPr>
+                <w:rFonts w:ascii="Aptos" w:eastAsia="Times New Roman" w:hAnsi="Aptos" w:cs="Times New Roman"/>
+              </w:rPr>
+              <w:t>High</w:t>
+            </w:r>
+          </w:p>
+        </w:tc>
+        <w:tc>
+          <w:tcPr>
+            <w:tcW w:w="1780" w:type="dxa"/>
+            <w:vAlign w:val="center"/>
+          </w:tcPr>
+          <w:p>
+            <w:pPr>
+              <w:jc w:val="center"/>
+              <w:textAlignment w:val="baseline"/>
+              <w:cnfStyle w:val="000000000000" w:firstRow="0" w:lastRow="0" w:firstColumn="0" w:lastColumn="0" w:oddVBand="0" w:evenVBand="0" w:oddHBand="0" w:evenHBand="0" w:firstRowFirstColumn="0" w:firstRowLastColumn="0" w:lastRowFirstColumn="0" w:lastRowLastColumn="0"/>
+              <w:rPr>
+                <w:rFonts w:ascii="Aptos" w:eastAsia="Times New Roman" w:hAnsi="Aptos" w:cs="Times New Roman"/>
+              </w:rPr>
+            </w:pPr>
+            <w:r>
+              <w:rPr>
+                <w:rFonts w:ascii="Aptos" w:eastAsia="Times New Roman" w:hAnsi="Aptos" w:cs="Times New Roman"/>
+              </w:rPr>
+              <w:t>3 sprints, 2 people, 30 hours</w:t>
+            </w:r>
+          </w:p>
+          <w:p>
+            <w:pPr>
+              <w:textAlignment w:val="baseline"/>
+              <w:cnfStyle w:val="000000000000" w:firstRow="0" w:lastRow="0" w:firstColumn="0" w:lastColumn="0" w:oddVBand="0" w:evenVBand="0" w:oddHBand="0" w:evenHBand="0" w:firstRowFirstColumn="0" w:firstRowLastColumn="0" w:lastRowFirstColumn="0" w:lastRowLastColumn="0"/>
+              <w:rPr>
+                <w:rFonts w:ascii="Aptos" w:eastAsia="Times New Roman" w:hAnsi="Aptos" w:cs="Times New Roman"/>
+              </w:rPr>
+            </w:pPr>
+          </w:p>
+        </w:tc>
+      </w:tr>
+      <w:tr>
+        <w:trPr>
+          <w:cnfStyle w:val="000000100000" w:firstRow="0" w:lastRow="0" w:firstColumn="0" w:lastColumn="0" w:oddVBand="0" w:evenVBand="0" w:oddHBand="1" w:evenHBand="0" w:firstRowFirstColumn="0" w:firstRowLastColumn="0" w:lastRowFirstColumn="0" w:lastRowLastColumn="0"/>
+          <w:trHeight w:val="1440"/>
+          <w:jc w:val="center"/>
+        </w:trPr>
+        <w:tc>
+          <w:tcPr>
+            <w:cnfStyle w:val="001000000000" w:firstRow="0" w:lastRow="0" w:firstColumn="1" w:lastColumn="0" w:oddVBand="0" w:evenVBand="0" w:oddHBand="0" w:evenHBand="0" w:firstRowFirstColumn="0" w:firstRowLastColumn="0" w:lastRowFirstColumn="0" w:lastRowLastColumn="0"/>
+            <w:tcW w:w="2102" w:type="dxa"/>
+            <w:vAlign w:val="center"/>
+          </w:tcPr>
+          <w:p>
+            <w:pPr>
+              <w:jc w:val="center"/>
+              <w:textAlignment w:val="baseline"/>
+              <w:rPr>
+                <w:rFonts w:ascii="Aptos" w:eastAsia="Times New Roman" w:hAnsi="Aptos" w:cs="Times New Roman"/>
+                <w:b w:val="0"/>
+                <w:bCs w:val="0"/>
+              </w:rPr>
+            </w:pPr>
+            <w:r>
+              <w:rPr>
+                <w:rFonts w:ascii="Aptos" w:eastAsia="Times New Roman" w:hAnsi="Aptos" w:cs="Times New Roman"/>
+              </w:rPr>
+              <w:t xml:space="preserve"> (</w:t>
+            </w:r>
+            <w:r>
+              <w:rPr>
+                <w:rFonts w:ascii="Aptos" w:eastAsia="Times New Roman" w:hAnsi="Aptos" w:cs="Times New Roman"/>
+              </w:rPr>
+              <w:t>Complete</w:t>
+            </w:r>
+            <w:r>
+              <w:rPr>
+                <w:rFonts w:ascii="Aptos" w:eastAsia="Times New Roman" w:hAnsi="Aptos" w:cs="Times New Roman"/>
+              </w:rPr>
+              <w:t>)</w:t>
+            </w:r>
+          </w:p>
+          <w:p>
+            <w:pPr>
+              <w:jc w:val="center"/>
+              <w:textAlignment w:val="baseline"/>
+              <w:rPr>
+                <w:rFonts w:ascii="Aptos" w:eastAsia="Times New Roman" w:hAnsi="Aptos" w:cs="Times New Roman"/>
+              </w:rPr>
+            </w:pPr>
+            <w:r>
+              <w:rPr>
+                <w:rFonts w:ascii="Aptos" w:eastAsia="Times New Roman" w:hAnsi="Aptos" w:cs="Times New Roman"/>
+              </w:rPr>
+              <w:t>Document Specialist</w:t>
+            </w:r>
+          </w:p>
+        </w:tc>
+        <w:tc>
+          <w:tcPr>
+            <w:tcW w:w="3972" w:type="dxa"/>
+            <w:vAlign w:val="center"/>
+          </w:tcPr>
+          <w:p>
+            <w:pPr>
+              <w:jc w:val="center"/>
+              <w:textAlignment w:val="baseline"/>
+              <w:cnfStyle w:val="000000100000" w:firstRow="0" w:lastRow="0" w:firstColumn="0" w:lastColumn="0" w:oddVBand="0" w:evenVBand="0" w:oddHBand="1" w:evenHBand="0" w:firstRowFirstColumn="0" w:firstRowLastColumn="0" w:lastRowFirstColumn="0" w:lastRowLastColumn="0"/>
+              <w:rPr>
+                <w:rFonts w:ascii="Aptos" w:eastAsia="Times New Roman" w:hAnsi="Aptos" w:cs="Times New Roman"/>
+              </w:rPr>
+            </w:pPr>
+            <w:r>
+              <w:rPr>
+                <w:rFonts w:ascii="Aptos" w:eastAsia="Times New Roman" w:hAnsi="Aptos" w:cs="Times New Roman"/>
+              </w:rPr>
+              <w:t xml:space="preserve">As a documentation specialist on this project, I want </w:t>
+            </w:r>
+            <w:proofErr w:type="gramStart"/>
+            <w:r>
+              <w:rPr>
+                <w:rFonts w:ascii="Aptos" w:eastAsia="Times New Roman" w:hAnsi="Aptos" w:cs="Times New Roman"/>
+              </w:rPr>
+              <w:t>all of</w:t>
+            </w:r>
+            <w:proofErr w:type="gramEnd"/>
+            <w:r>
+              <w:rPr>
+                <w:rFonts w:ascii="Aptos" w:eastAsia="Times New Roman" w:hAnsi="Aptos" w:cs="Times New Roman"/>
+              </w:rPr>
+              <w:t xml:space="preserve"> the documentation to be readily available and up to date in the GitHub repository.</w:t>
+            </w:r>
+          </w:p>
+        </w:tc>
+        <w:tc>
+          <w:tcPr>
+            <w:tcW w:w="1496" w:type="dxa"/>
+            <w:vAlign w:val="center"/>
+          </w:tcPr>
+          <w:p>
+            <w:pPr>
+              <w:jc w:val="center"/>
+              <w:textAlignment w:val="baseline"/>
+              <w:cnfStyle w:val="000000100000" w:firstRow="0" w:lastRow="0" w:firstColumn="0" w:lastColumn="0" w:oddVBand="0" w:evenVBand="0" w:oddHBand="1" w:evenHBand="0" w:firstRowFirstColumn="0" w:firstRowLastColumn="0" w:lastRowFirstColumn="0" w:lastRowLastColumn="0"/>
+              <w:rPr>
+                <w:rFonts w:ascii="Aptos" w:eastAsia="Times New Roman" w:hAnsi="Aptos" w:cs="Times New Roman"/>
+              </w:rPr>
+            </w:pPr>
+            <w:r>
+              <w:rPr>
+                <w:rFonts w:ascii="Aptos" w:eastAsia="Times New Roman" w:hAnsi="Aptos" w:cs="Times New Roman"/>
+              </w:rPr>
+              <w:t>High</w:t>
+            </w:r>
+          </w:p>
+        </w:tc>
+        <w:tc>
+          <w:tcPr>
+            <w:tcW w:w="1780" w:type="dxa"/>
+            <w:vAlign w:val="center"/>
+          </w:tcPr>
+          <w:p>
+            <w:pPr>
+              <w:jc w:val="center"/>
+              <w:textAlignment w:val="baseline"/>
+              <w:cnfStyle w:val="000000100000" w:firstRow="0" w:lastRow="0" w:firstColumn="0" w:lastColumn="0" w:oddVBand="0" w:evenVBand="0" w:oddHBand="1" w:evenHBand="0" w:firstRowFirstColumn="0" w:firstRowLastColumn="0" w:lastRowFirstColumn="0" w:lastRowLastColumn="0"/>
+              <w:rPr>
+                <w:rFonts w:ascii="Aptos" w:eastAsia="Times New Roman" w:hAnsi="Aptos" w:cs="Times New Roman"/>
+              </w:rPr>
+            </w:pPr>
+            <w:r>
+              <w:rPr>
+                <w:rFonts w:ascii="Aptos" w:eastAsia="Times New Roman" w:hAnsi="Aptos" w:cs="Times New Roman"/>
+              </w:rPr>
+              <w:t xml:space="preserve">6 </w:t>
+            </w:r>
+            <w:proofErr w:type="gramStart"/>
+            <w:r>
+              <w:rPr>
+                <w:rFonts w:ascii="Aptos" w:eastAsia="Times New Roman" w:hAnsi="Aptos" w:cs="Times New Roman"/>
+              </w:rPr>
+              <w:t>sprint</w:t>
+            </w:r>
+            <w:proofErr w:type="gramEnd"/>
+            <w:r>
+              <w:rPr>
+                <w:rFonts w:ascii="Aptos" w:eastAsia="Times New Roman" w:hAnsi="Aptos" w:cs="Times New Roman"/>
+              </w:rPr>
+              <w:t>, 1 person, 2 hours</w:t>
+            </w:r>
+          </w:p>
+        </w:tc>
+      </w:tr>
+      <w:tr>
+        <w:trPr>
+          <w:trHeight w:val="1440"/>
+          <w:jc w:val="center"/>
+        </w:trPr>
+        <w:tc>
+          <w:tcPr>
+            <w:cnfStyle w:val="001000000000" w:firstRow="0" w:lastRow="0" w:firstColumn="1" w:lastColumn="0" w:oddVBand="0" w:evenVBand="0" w:oddHBand="0" w:evenHBand="0" w:firstRowFirstColumn="0" w:firstRowLastColumn="0" w:lastRowFirstColumn="0" w:lastRowLastColumn="0"/>
+            <w:tcW w:w="2102" w:type="dxa"/>
+            <w:vAlign w:val="center"/>
+          </w:tcPr>
+          <w:p>
+            <w:pPr>
+              <w:jc w:val="center"/>
+              <w:textAlignment w:val="baseline"/>
+              <w:rPr>
+                <w:rFonts w:ascii="Aptos" w:eastAsia="Times New Roman" w:hAnsi="Aptos" w:cs="Times New Roman"/>
+              </w:rPr>
+            </w:pPr>
+            <w:r>
+              <w:rPr>
+                <w:rFonts w:ascii="Aptos" w:eastAsia="Times New Roman" w:hAnsi="Aptos" w:cs="Times New Roman"/>
+              </w:rPr>
+              <w:lastRenderedPageBreak/>
+              <w:t>Web App User</w:t>
+            </w:r>
+          </w:p>
+        </w:tc>
+        <w:tc>
+          <w:tcPr>
+            <w:tcW w:w="3972" w:type="dxa"/>
+            <w:vAlign w:val="center"/>
+          </w:tcPr>
+          <w:p>
+            <w:pPr>
+              <w:jc w:val="center"/>
+              <w:textAlignment w:val="baseline"/>
+              <w:cnfStyle w:val="000000000000" w:firstRow="0" w:lastRow="0" w:firstColumn="0" w:lastColumn="0" w:oddVBand="0" w:evenVBand="0" w:oddHBand="0" w:evenHBand="0" w:firstRowFirstColumn="0" w:firstRowLastColumn="0" w:lastRowFirstColumn="0" w:lastRowLastColumn="0"/>
+              <w:rPr>
+                <w:rFonts w:ascii="Aptos" w:eastAsia="Times New Roman" w:hAnsi="Aptos" w:cs="Times New Roman"/>
+              </w:rPr>
+            </w:pPr>
+            <w:r>
+              <w:rPr>
+                <w:rFonts w:ascii="Aptos" w:eastAsia="Times New Roman" w:hAnsi="Aptos" w:cs="Times New Roman"/>
+              </w:rPr>
+              <w:t>As a user of the MEVA application, I want the application to display properly on both desktop and mobile devices so that I can use either to access the web app.</w:t>
+            </w:r>
+          </w:p>
+        </w:tc>
+        <w:tc>
+          <w:tcPr>
+            <w:tcW w:w="1496" w:type="dxa"/>
+            <w:vAlign w:val="center"/>
+          </w:tcPr>
+          <w:p>
+            <w:pPr>
+              <w:jc w:val="center"/>
+              <w:textAlignment w:val="baseline"/>
+              <w:cnfStyle w:val="000000000000" w:firstRow="0" w:lastRow="0" w:firstColumn="0" w:lastColumn="0" w:oddVBand="0" w:evenVBand="0" w:oddHBand="0" w:evenHBand="0" w:firstRowFirstColumn="0" w:firstRowLastColumn="0" w:lastRowFirstColumn="0" w:lastRowLastColumn="0"/>
+              <w:rPr>
+                <w:rFonts w:ascii="Aptos" w:eastAsia="Times New Roman" w:hAnsi="Aptos" w:cs="Times New Roman"/>
+              </w:rPr>
+            </w:pPr>
+            <w:r>
+              <w:rPr>
+                <w:rFonts w:ascii="Aptos" w:eastAsia="Times New Roman" w:hAnsi="Aptos" w:cs="Times New Roman"/>
+              </w:rPr>
+              <w:t>Medium</w:t>
+            </w:r>
+          </w:p>
+        </w:tc>
+        <w:tc>
+          <w:tcPr>
+            <w:tcW w:w="1780" w:type="dxa"/>
+            <w:vAlign w:val="center"/>
+          </w:tcPr>
+          <w:p>
+            <w:pPr>
+              <w:jc w:val="center"/>
+              <w:textAlignment w:val="baseline"/>
+              <w:cnfStyle w:val="000000000000" w:firstRow="0" w:lastRow="0" w:firstColumn="0" w:lastColumn="0" w:oddVBand="0" w:evenVBand="0" w:oddHBand="0" w:evenHBand="0" w:firstRowFirstColumn="0" w:firstRowLastColumn="0" w:lastRowFirstColumn="0" w:lastRowLastColumn="0"/>
+              <w:rPr>
+                <w:rFonts w:ascii="Aptos" w:eastAsia="Times New Roman" w:hAnsi="Aptos" w:cs="Times New Roman"/>
+              </w:rPr>
+            </w:pPr>
+            <w:r>
+              <w:rPr>
+                <w:rFonts w:ascii="Aptos" w:eastAsia="Times New Roman" w:hAnsi="Aptos" w:cs="Times New Roman"/>
+              </w:rPr>
+              <w:t>2 sprints, 1 person, 10 hours</w:t>
+            </w:r>
+          </w:p>
+        </w:tc>
+      </w:tr>
+      <w:tr>
+        <w:trPr>
+          <w:cnfStyle w:val="000000100000" w:firstRow="0" w:lastRow="0" w:firstColumn="0" w:lastColumn="0" w:oddVBand="0" w:evenVBand="0" w:oddHBand="1" w:evenHBand="0" w:firstRowFirstColumn="0" w:firstRowLastColumn="0" w:lastRowFirstColumn="0" w:lastRowLastColumn="0"/>
+          <w:trHeight w:val="1440"/>
+          <w:jc w:val="center"/>
+        </w:trPr>
+        <w:tc>
+          <w:tcPr>
+            <w:cnfStyle w:val="001000000000" w:firstRow="0" w:lastRow="0" w:firstColumn="1" w:lastColumn="0" w:oddVBand="0" w:evenVBand="0" w:oddHBand="0" w:evenHBand="0" w:firstRowFirstColumn="0" w:firstRowLastColumn="0" w:lastRowFirstColumn="0" w:lastRowLastColumn="0"/>
+            <w:tcW w:w="2102" w:type="dxa"/>
+            <w:vAlign w:val="center"/>
+          </w:tcPr>
+          <w:p>
+            <w:pPr>
+              <w:jc w:val="center"/>
+              <w:textAlignment w:val="baseline"/>
+              <w:rPr>
+                <w:rFonts w:ascii="Aptos" w:eastAsia="Times New Roman" w:hAnsi="Aptos" w:cs="Times New Roman"/>
+              </w:rPr>
+            </w:pPr>
+            <w:r>
+              <w:rPr>
+                <w:rFonts w:ascii="Aptos" w:eastAsia="Times New Roman" w:hAnsi="Aptos" w:cs="Times New Roman"/>
+              </w:rPr>
+              <w:t>(C</w:t>
+            </w:r>
+            <w:r>
+              <w:rPr>
+                <w:rFonts w:ascii="Aptos" w:eastAsia="Times New Roman" w:hAnsi="Aptos" w:cs="Times New Roman"/>
+              </w:rPr>
+              <w:t>omplete</w:t>
+            </w:r>
+            <w:r>
+              <w:rPr>
+                <w:rFonts w:ascii="Aptos" w:eastAsia="Times New Roman" w:hAnsi="Aptos" w:cs="Times New Roman"/>
+              </w:rPr>
+              <w:t>) Database Developer</w:t>
+            </w:r>
+          </w:p>
+        </w:tc>
+        <w:tc>
+          <w:tcPr>
+            <w:tcW w:w="3972" w:type="dxa"/>
+            <w:vAlign w:val="center"/>
+          </w:tcPr>
+          <w:p>
+            <w:pPr>
+              <w:jc w:val="center"/>
+              <w:textAlignment w:val="baseline"/>
+              <w:cnfStyle w:val="000000100000" w:firstRow="0" w:lastRow="0" w:firstColumn="0" w:lastColumn="0" w:oddVBand="0" w:evenVBand="0" w:oddHBand="1" w:evenHBand="0" w:firstRowFirstColumn="0" w:firstRowLastColumn="0" w:lastRowFirstColumn="0" w:lastRowLastColumn="0"/>
+              <w:rPr>
+                <w:rFonts w:ascii="Aptos" w:eastAsia="Times New Roman" w:hAnsi="Aptos" w:cs="Times New Roman"/>
+              </w:rPr>
+            </w:pPr>
+            <w:r>
+              <w:rPr>
+                <w:rFonts w:ascii="Aptos" w:eastAsia="Times New Roman" w:hAnsi="Aptos" w:cs="Times New Roman"/>
+              </w:rPr>
+              <w:t>As a database developer on the MEVA project, I want to connect the database layer to the API layer, so that captured data is safely stored for later reference.</w:t>
+            </w:r>
+          </w:p>
+        </w:tc>
+        <w:tc>
+          <w:tcPr>
+            <w:tcW w:w="1496" w:type="dxa"/>
+            <w:vAlign w:val="center"/>
+          </w:tcPr>
+          <w:p>
+            <w:pPr>
+              <w:jc w:val="center"/>
+              <w:textAlignment w:val="baseline"/>
+              <w:cnfStyle w:val="000000100000" w:firstRow="0" w:lastRow="0" w:firstColumn="0" w:lastColumn="0" w:oddVBand="0" w:evenVBand="0" w:oddHBand="1" w:evenHBand="0" w:firstRowFirstColumn="0" w:firstRowLastColumn="0" w:lastRowFirstColumn="0" w:lastRowLastColumn="0"/>
+              <w:rPr>
+                <w:rFonts w:ascii="Aptos" w:eastAsia="Times New Roman" w:hAnsi="Aptos" w:cs="Times New Roman"/>
+              </w:rPr>
+            </w:pPr>
+            <w:r>
+              <w:rPr>
+                <w:rFonts w:ascii="Aptos" w:eastAsia="Times New Roman" w:hAnsi="Aptos" w:cs="Times New Roman"/>
+              </w:rPr>
+              <w:t>High</w:t>
+            </w:r>
+          </w:p>
+        </w:tc>
+        <w:tc>
+          <w:tcPr>
+            <w:tcW w:w="1780" w:type="dxa"/>
+            <w:vAlign w:val="center"/>
+          </w:tcPr>
+          <w:p>
+            <w:pPr>
+              <w:jc w:val="center"/>
+              <w:textAlignment w:val="baseline"/>
+              <w:cnfStyle w:val="000000100000" w:firstRow="0" w:lastRow="0" w:firstColumn="0" w:lastColumn="0" w:oddVBand="0" w:evenVBand="0" w:oddHBand="1" w:evenHBand="0" w:firstRowFirstColumn="0" w:firstRowLastColumn="0" w:lastRowFirstColumn="0" w:lastRowLastColumn="0"/>
+              <w:rPr>
+                <w:rFonts w:ascii="Aptos" w:eastAsia="Times New Roman" w:hAnsi="Aptos" w:cs="Times New Roman"/>
+              </w:rPr>
+            </w:pPr>
+            <w:r>
+              <w:rPr>
+                <w:rFonts w:ascii="Aptos" w:eastAsia="Times New Roman" w:hAnsi="Aptos" w:cs="Times New Roman"/>
+              </w:rPr>
+              <w:t>1 sprint, 1 person, 10 hours</w:t>
+            </w:r>
+          </w:p>
+        </w:tc>
+      </w:tr>
+      <w:tr>
+        <w:trPr>
+          <w:trHeight w:val="1440"/>
+          <w:jc w:val="center"/>
+        </w:trPr>
+        <w:tc>
+          <w:tcPr>
+            <w:cnfStyle w:val="001000000000" w:firstRow="0" w:lastRow="0" w:firstColumn="1" w:lastColumn="0" w:oddVBand="0" w:evenVBand="0" w:oddHBand="0" w:evenHBand="0" w:firstRowFirstColumn="0" w:firstRowLastColumn="0" w:lastRowFirstColumn="0" w:lastRowLastColumn="0"/>
+            <w:tcW w:w="2102" w:type="dxa"/>
+            <w:vAlign w:val="center"/>
+          </w:tcPr>
+          <w:p>
+            <w:pPr>
+              <w:jc w:val="center"/>
+              <w:textAlignment w:val="baseline"/>
+              <w:rPr>
+                <w:rFonts w:ascii="Aptos" w:eastAsia="Times New Roman" w:hAnsi="Aptos" w:cs="Times New Roman"/>
+              </w:rPr>
+            </w:pPr>
+            <w:r>
+              <w:rPr>
+                <w:rFonts w:ascii="Aptos" w:eastAsia="Times New Roman" w:hAnsi="Aptos" w:cs="Times New Roman"/>
+              </w:rPr>
+              <w:t>(Complete) Software Developer</w:t>
+            </w:r>
+          </w:p>
+        </w:tc>
+        <w:tc>
+          <w:tcPr>
+            <w:tcW w:w="3972" w:type="dxa"/>
+            <w:vAlign w:val="center"/>
+          </w:tcPr>
+          <w:p>
+            <w:pPr>
+              <w:jc w:val="center"/>
+              <w:textAlignment w:val="baseline"/>
+              <w:cnfStyle w:val="000000000000" w:firstRow="0" w:lastRow="0" w:firstColumn="0" w:lastColumn="0" w:oddVBand="0" w:evenVBand="0" w:oddHBand="0" w:evenHBand="0" w:firstRowFirstColumn="0" w:firstRowLastColumn="0" w:lastRowFirstColumn="0" w:lastRowLastColumn="0"/>
+              <w:rPr>
+                <w:rFonts w:ascii="Aptos" w:eastAsia="Times New Roman" w:hAnsi="Aptos" w:cs="Times New Roman"/>
+              </w:rPr>
+            </w:pPr>
+            <w:r>
+              <w:rPr>
+                <w:rFonts w:ascii="Aptos" w:eastAsia="Times New Roman" w:hAnsi="Aptos" w:cs="Times New Roman"/>
+              </w:rPr>
+              <w:t>As a software developer for the MEVA project, I want to ensure that the logged in user can only access areas of the site that they are authorized to access.</w:t>
+            </w:r>
+          </w:p>
+        </w:tc>
+        <w:tc>
+          <w:tcPr>
+            <w:tcW w:w="1496" w:type="dxa"/>
+            <w:vAlign w:val="center"/>
+          </w:tcPr>
+          <w:p>
+            <w:pPr>
+              <w:jc w:val="center"/>
+              <w:textAlignment w:val="baseline"/>
+              <w:cnfStyle w:val="000000000000" w:firstRow="0" w:lastRow="0" w:firstColumn="0" w:lastColumn="0" w:oddVBand="0" w:evenVBand="0" w:oddHBand="0" w:evenHBand="0" w:firstRowFirstColumn="0" w:firstRowLastColumn="0" w:lastRowFirstColumn="0" w:lastRowLastColumn="0"/>
+              <w:rPr>
+                <w:rFonts w:ascii="Aptos" w:eastAsia="Times New Roman" w:hAnsi="Aptos" w:cs="Times New Roman"/>
+              </w:rPr>
+            </w:pPr>
+            <w:r>
+              <w:rPr>
+                <w:rFonts w:ascii="Aptos" w:eastAsia="Times New Roman" w:hAnsi="Aptos" w:cs="Times New Roman"/>
+              </w:rPr>
+              <w:t>High</w:t>
+            </w:r>
+          </w:p>
+        </w:tc>
+        <w:tc>
+          <w:tcPr>
+            <w:tcW w:w="1780" w:type="dxa"/>
+            <w:vAlign w:val="center"/>
+          </w:tcPr>
+          <w:p>
+            <w:pPr>
+              <w:jc w:val="center"/>
+              <w:textAlignment w:val="baseline"/>
+              <w:cnfStyle w:val="000000000000" w:firstRow="0" w:lastRow="0" w:firstColumn="0" w:lastColumn="0" w:oddVBand="0" w:evenVBand="0" w:oddHBand="0" w:evenHBand="0" w:firstRowFirstColumn="0" w:firstRowLastColumn="0" w:lastRowFirstColumn="0" w:lastRowLastColumn="0"/>
+              <w:rPr>
+                <w:rFonts w:ascii="Aptos" w:eastAsia="Times New Roman" w:hAnsi="Aptos" w:cs="Times New Roman"/>
+              </w:rPr>
+            </w:pPr>
+            <w:r>
+              <w:rPr>
+                <w:rFonts w:ascii="Aptos" w:eastAsia="Times New Roman" w:hAnsi="Aptos" w:cs="Times New Roman"/>
+              </w:rPr>
+              <w:t>6 sprints, 1 person, 20 hours</w:t>
+            </w:r>
+          </w:p>
+        </w:tc>
+      </w:tr>
+      <w:tr>
+        <w:trPr>
+          <w:cnfStyle w:val="000000100000" w:firstRow="0" w:lastRow="0" w:firstColumn="0" w:lastColumn="0" w:oddVBand="0" w:evenVBand="0" w:oddHBand="1" w:evenHBand="0" w:firstRowFirstColumn="0" w:firstRowLastColumn="0" w:lastRowFirstColumn="0" w:lastRowLastColumn="0"/>
+          <w:trHeight w:val="1440"/>
+          <w:jc w:val="center"/>
+        </w:trPr>
+        <w:tc>
+          <w:tcPr>
+            <w:cnfStyle w:val="001000000000" w:firstRow="0" w:lastRow="0" w:firstColumn="1" w:lastColumn="0" w:oddVBand="0" w:evenVBand="0" w:oddHBand="0" w:evenHBand="0" w:firstRowFirstColumn="0" w:firstRowLastColumn="0" w:lastRowFirstColumn="0" w:lastRowLastColumn="0"/>
+            <w:tcW w:w="2102" w:type="dxa"/>
+            <w:vAlign w:val="center"/>
+          </w:tcPr>
+          <w:p>
+            <w:pPr>
+              <w:jc w:val="center"/>
+              <w:textAlignment w:val="baseline"/>
+              <w:rPr>
+                <w:rFonts w:ascii="Aptos" w:eastAsia="Times New Roman" w:hAnsi="Aptos" w:cs="Times New Roman"/>
+              </w:rPr>
+            </w:pPr>
+            <w:r>
+              <w:rPr>
+                <w:rFonts w:ascii="Aptos" w:eastAsia="Times New Roman" w:hAnsi="Aptos" w:cs="Times New Roman"/>
+              </w:rPr>
+              <w:t>(Complete) Medicaid Employee</w:t>
+            </w:r>
+          </w:p>
+        </w:tc>
+        <w:tc>
+          <w:tcPr>
+            <w:tcW w:w="3972" w:type="dxa"/>
+            <w:vAlign w:val="center"/>
+          </w:tcPr>
+          <w:p>
+            <w:pPr>
+              <w:jc w:val="center"/>
+              <w:textAlignment w:val="baseline"/>
+              <w:cnfStyle w:val="000000100000" w:firstRow="0" w:lastRow="0" w:firstColumn="0" w:lastColumn="0" w:oddVBand="0" w:evenVBand="0" w:oddHBand="1" w:evenHBand="0" w:firstRowFirstColumn="0" w:firstRowLastColumn="0" w:lastRowFirstColumn="0" w:lastRowLastColumn="0"/>
+              <w:rPr>
+                <w:rFonts w:ascii="Aptos" w:eastAsia="Times New Roman" w:hAnsi="Aptos" w:cs="Times New Roman"/>
+              </w:rPr>
+            </w:pPr>
+            <w:r>
+              <w:rPr>
+                <w:rFonts w:ascii="Aptos" w:eastAsia="Times New Roman" w:hAnsi="Aptos" w:cs="Times New Roman"/>
+              </w:rPr>
+              <w:t>As a Medicaid employee, I want to have access to a dashboard that organizes applicant data so that I can more easily review their applications.</w:t>
+            </w:r>
+          </w:p>
+        </w:tc>
+        <w:tc>
+          <w:tcPr>
+            <w:tcW w:w="1496" w:type="dxa"/>
+            <w:vAlign w:val="center"/>
+          </w:tcPr>
+          <w:p>
+            <w:pPr>
+              <w:jc w:val="center"/>
+              <w:textAlignment w:val="baseline"/>
+              <w:cnfStyle w:val="000000100000" w:firstRow="0" w:lastRow="0" w:firstColumn="0" w:lastColumn="0" w:oddVBand="0" w:evenVBand="0" w:oddHBand="1" w:evenHBand="0" w:firstRowFirstColumn="0" w:firstRowLastColumn="0" w:lastRowFirstColumn="0" w:lastRowLastColumn="0"/>
+              <w:rPr>
+                <w:rFonts w:ascii="Aptos" w:eastAsia="Times New Roman" w:hAnsi="Aptos" w:cs="Times New Roman"/>
+              </w:rPr>
+            </w:pPr>
+            <w:r>
+              <w:rPr>
+                <w:rFonts w:ascii="Aptos" w:eastAsia="Times New Roman" w:hAnsi="Aptos" w:cs="Times New Roman"/>
+              </w:rPr>
+              <w:t>Medium</w:t>
+            </w:r>
+          </w:p>
+        </w:tc>
+        <w:tc>
+          <w:tcPr>
+            <w:tcW w:w="1780" w:type="dxa"/>
+            <w:vAlign w:val="center"/>
+          </w:tcPr>
+          <w:p>
+            <w:pPr>
+              <w:jc w:val="center"/>
+              <w:textAlignment w:val="baseline"/>
+              <w:cnfStyle w:val="000000100000" w:firstRow="0" w:lastRow="0" w:firstColumn="0" w:lastColumn="0" w:oddVBand="0" w:evenVBand="0" w:oddHBand="1" w:evenHBand="0" w:firstRowFirstColumn="0" w:firstRowLastColumn="0" w:lastRowFirstColumn="0" w:lastRowLastColumn="0"/>
+              <w:rPr>
+                <w:rFonts w:ascii="Aptos" w:eastAsia="Times New Roman" w:hAnsi="Aptos" w:cs="Times New Roman"/>
+              </w:rPr>
+            </w:pPr>
+            <w:r>
+              <w:rPr>
+                <w:rFonts w:ascii="Aptos" w:eastAsia="Times New Roman" w:hAnsi="Aptos" w:cs="Times New Roman"/>
+              </w:rPr>
+              <w:t>1 sprint, 1 person, 15 hours</w:t>
             </w:r>
           </w:p>
         </w:tc>

</xml_diff>